<commit_message>
Fixed a syllabus error
</commit_message>
<xml_diff>
--- a/F26-Phil101-site/syllabus-F26-101.docx
+++ b/F26-Phil101-site/syllabus-F26-101.docx
@@ -954,7 +954,7 @@
       </w:r>
     </w:p>
     <w:bookmarkEnd w:id="16"/>
-    <w:bookmarkStart w:id="118" w:name="class-schedule"/>
+    <w:bookmarkStart w:id="117" w:name="class-schedule"/>
     <w:p>
       <w:pPr>
         <w:pStyle w:val="Heading1"/>
@@ -1723,7 +1723,7 @@
     </w:p>
     <w:bookmarkEnd w:id="40"/>
     <w:bookmarkEnd w:id="41"/>
-    <w:bookmarkStart w:id="49" w:name="week-5-science-and-the-mind"/>
+    <w:bookmarkStart w:id="48" w:name="week-5-science-and-the-mind"/>
     <w:p>
       <w:pPr>
         <w:pStyle w:val="Heading2"/>
@@ -1732,7 +1732,7 @@
         <w:t xml:space="preserve">Week 5: Science, and the Mind</w:t>
       </w:r>
     </w:p>
-    <w:bookmarkStart w:id="44" w:name="Xf44765c1fcea86a2394376c21e048eae4d225b4"/>
+    <w:bookmarkStart w:id="47" w:name="Xf44765c1fcea86a2394376c21e048eae4d225b4"/>
     <w:p>
       <w:pPr>
         <w:pStyle w:val="Heading3"/>
@@ -1860,22 +1860,12 @@
         <w:t xml:space="preserve"> </w:t>
       </w:r>
       <w:r>
-        <w:t xml:space="preserve">(NOTE FOR GSIs; should I just post the questions earlier?)</w:t>
-      </w:r>
-    </w:p>
-    <w:bookmarkEnd w:id="44"/>
-    <w:bookmarkStart w:id="48" w:name="X0b9314308d9385921b437b2ed817f2353b12170"/>
-    <w:p>
-      <w:pPr>
-        <w:pStyle w:val="Heading3"/>
-      </w:pPr>
-      <w:r>
-        <w:t xml:space="preserve">Thursday, October 01 (Lecture 10) — Perception reconsidered</w:t>
-      </w:r>
-    </w:p>
-    <w:p>
-      <w:pPr>
-        <w:pStyle w:val="FirstParagraph"/>
+        <w:t xml:space="preserve">### Thursday, October 01 (Lecture 10) — Perception reconsidered</w:t>
+      </w:r>
+    </w:p>
+    <w:p>
+      <w:pPr>
+        <w:pStyle w:val="BodyText"/>
       </w:pPr>
       <w:r>
         <w:rPr>
@@ -1890,7 +1880,7 @@
       <w:r>
         <w:t xml:space="preserve"> </w:t>
       </w:r>
-      <w:hyperlink r:id="rId45">
+      <w:hyperlink r:id="rId44">
         <w:r>
           <w:rPr>
             <w:rStyle w:val="Hyperlink"/>
@@ -1925,60 +1915,60 @@
       <w:r>
         <w:t xml:space="preserve"> </w:t>
       </w:r>
+      <w:hyperlink r:id="rId45">
+        <w:r>
+          <w:rPr>
+            <w:rStyle w:val="Hyperlink"/>
+          </w:rPr>
+          <w:t xml:space="preserve">“The Problem of Perception”</w:t>
+        </w:r>
+      </w:hyperlink>
+      <w:r>
+        <w:t xml:space="preserve">, SEP,</w:t>
+      </w:r>
+      <w:r>
+        <w:t xml:space="preserve"> </w:t>
+      </w:r>
+      <w:r>
+        <w:t xml:space="preserve">“The Argument from Illusion”</w:t>
+      </w:r>
+      <w:r>
+        <w:t xml:space="preserve">,</w:t>
+      </w:r>
+      <w:r>
+        <w:t xml:space="preserve"> </w:t>
+      </w:r>
+      <w:r>
+        <w:rPr>
+          <w:b/>
+          <w:bCs/>
+        </w:rPr>
+        <w:t xml:space="preserve">§2</w:t>
+      </w:r>
+      <w:r>
+        <w:t xml:space="preserve">.</w:t>
+      </w:r>
+      <w:r>
+        <w:br/>
+      </w:r>
+      <w:r>
+        <w:rPr>
+          <w:b/>
+          <w:bCs/>
+        </w:rPr>
+        <w:t xml:space="preserve">Recommended</w:t>
+      </w:r>
+      <w:r>
+        <w:t xml:space="preserve">: Paul Coates,</w:t>
+      </w:r>
+      <w:r>
+        <w:t xml:space="preserve"> </w:t>
+      </w:r>
       <w:hyperlink r:id="rId46">
         <w:r>
           <w:rPr>
             <w:rStyle w:val="Hyperlink"/>
           </w:rPr>
-          <w:t xml:space="preserve">“The Problem of Perception”</w:t>
-        </w:r>
-      </w:hyperlink>
-      <w:r>
-        <w:t xml:space="preserve">, SEP,</w:t>
-      </w:r>
-      <w:r>
-        <w:t xml:space="preserve"> </w:t>
-      </w:r>
-      <w:r>
-        <w:t xml:space="preserve">“The Argument from Illusion”</w:t>
-      </w:r>
-      <w:r>
-        <w:t xml:space="preserve">,</w:t>
-      </w:r>
-      <w:r>
-        <w:t xml:space="preserve"> </w:t>
-      </w:r>
-      <w:r>
-        <w:rPr>
-          <w:b/>
-          <w:bCs/>
-        </w:rPr>
-        <w:t xml:space="preserve">§2</w:t>
-      </w:r>
-      <w:r>
-        <w:t xml:space="preserve">.</w:t>
-      </w:r>
-      <w:r>
-        <w:br/>
-      </w:r>
-      <w:r>
-        <w:rPr>
-          <w:b/>
-          <w:bCs/>
-        </w:rPr>
-        <w:t xml:space="preserve">Recommended</w:t>
-      </w:r>
-      <w:r>
-        <w:t xml:space="preserve">: Paul Coates,</w:t>
-      </w:r>
-      <w:r>
-        <w:t xml:space="preserve"> </w:t>
-      </w:r>
-      <w:hyperlink r:id="rId47">
-        <w:r>
-          <w:rPr>
-            <w:rStyle w:val="Hyperlink"/>
-          </w:rPr>
           <w:t xml:space="preserve">“Sense-Data”</w:t>
         </w:r>
       </w:hyperlink>
@@ -1986,9 +1976,9 @@
         <w:t xml:space="preserve">, IEP.</w:t>
       </w:r>
     </w:p>
+    <w:bookmarkEnd w:id="47"/>
     <w:bookmarkEnd w:id="48"/>
-    <w:bookmarkEnd w:id="49"/>
-    <w:bookmarkStart w:id="55" w:name="week-6-consciousness"/>
+    <w:bookmarkStart w:id="54" w:name="week-6-consciousness"/>
     <w:p>
       <w:pPr>
         <w:pStyle w:val="Heading2"/>
@@ -2009,7 +1999,7 @@
         <w:t xml:space="preserve">Short Answer 1 is written in section this week.</w:t>
       </w:r>
     </w:p>
-    <w:bookmarkStart w:id="51" w:name="X200a3672f4c346e20ebf81884b33047daa72e40"/>
+    <w:bookmarkStart w:id="50" w:name="X200a3672f4c346e20ebf81884b33047daa72e40"/>
     <w:p>
       <w:pPr>
         <w:pStyle w:val="Heading3"/>
@@ -2035,7 +2025,7 @@
       <w:r>
         <w:t xml:space="preserve"> </w:t>
       </w:r>
-      <w:hyperlink r:id="rId50">
+      <w:hyperlink r:id="rId49">
         <w:r>
           <w:rPr>
             <w:rStyle w:val="Hyperlink"/>
@@ -2047,8 +2037,8 @@
         <w:t xml:space="preserve">. Note this is slightly more reading than most days in class.</w:t>
       </w:r>
     </w:p>
-    <w:bookmarkEnd w:id="51"/>
-    <w:bookmarkStart w:id="54" w:name="X5c0ffa8a65d715d07dd794e56183fe1c6a9b038"/>
+    <w:bookmarkEnd w:id="50"/>
+    <w:bookmarkStart w:id="53" w:name="X5c0ffa8a65d715d07dd794e56183fe1c6a9b038"/>
     <w:p>
       <w:pPr>
         <w:pStyle w:val="Heading3"/>
@@ -2074,37 +2064,37 @@
       <w:r>
         <w:t xml:space="preserve"> </w:t>
       </w:r>
+      <w:hyperlink r:id="rId51">
+        <w:r>
+          <w:rPr>
+            <w:rStyle w:val="Hyperlink"/>
+          </w:rPr>
+          <w:t xml:space="preserve">“The Knowledge Argument Against Physicalism”</w:t>
+        </w:r>
+      </w:hyperlink>
+      <w:r>
+        <w:t xml:space="preserve"> </w:t>
+      </w:r>
+      <w:r>
+        <w:t xml:space="preserve">(1000-Word Philosophy).</w:t>
+      </w:r>
+      <w:r>
+        <w:br/>
+      </w:r>
+      <w:r>
+        <w:rPr>
+          <w:b/>
+          <w:bCs/>
+        </w:rPr>
+        <w:t xml:space="preserve">Required</w:t>
+      </w:r>
+      <w:r>
+        <w:t xml:space="preserve">: Frank Jackson,</w:t>
+      </w:r>
+      <w:r>
+        <w:t xml:space="preserve"> </w:t>
+      </w:r>
       <w:hyperlink r:id="rId52">
-        <w:r>
-          <w:rPr>
-            <w:rStyle w:val="Hyperlink"/>
-          </w:rPr>
-          <w:t xml:space="preserve">“The Knowledge Argument Against Physicalism”</w:t>
-        </w:r>
-      </w:hyperlink>
-      <w:r>
-        <w:t xml:space="preserve"> </w:t>
-      </w:r>
-      <w:r>
-        <w:t xml:space="preserve">(1000-Word Philosophy).</w:t>
-      </w:r>
-      <w:r>
-        <w:br/>
-      </w:r>
-      <w:r>
-        <w:rPr>
-          <w:b/>
-          <w:bCs/>
-        </w:rPr>
-        <w:t xml:space="preserve">Required</w:t>
-      </w:r>
-      <w:r>
-        <w:t xml:space="preserve">: Frank Jackson,</w:t>
-      </w:r>
-      <w:r>
-        <w:t xml:space="preserve"> </w:t>
-      </w:r>
-      <w:hyperlink r:id="rId53">
         <w:r>
           <w:rPr>
             <w:rStyle w:val="Hyperlink"/>
@@ -2128,9 +2118,9 @@
         <w:t xml:space="preserve">Short Answer 2 goes out after class, on Lectures 10 to 12, due Friday 23 October.</w:t>
       </w:r>
     </w:p>
+    <w:bookmarkEnd w:id="53"/>
     <w:bookmarkEnd w:id="54"/>
-    <w:bookmarkEnd w:id="55"/>
-    <w:bookmarkStart w:id="64" w:name="week-7-dualism"/>
+    <w:bookmarkStart w:id="63" w:name="week-7-dualism"/>
     <w:p>
       <w:pPr>
         <w:pStyle w:val="Heading2"/>
@@ -2139,7 +2129,7 @@
         <w:t xml:space="preserve">Week 7: Dualism</w:t>
       </w:r>
     </w:p>
-    <w:bookmarkStart w:id="60" w:name="X28f07e07b0ed06b9de4ffbf5e0d4c03242e17c1"/>
+    <w:bookmarkStart w:id="59" w:name="X28f07e07b0ed06b9de4ffbf5e0d4c03242e17c1"/>
     <w:p>
       <w:pPr>
         <w:pStyle w:val="Heading3"/>
@@ -2165,7 +2155,7 @@
       <w:r>
         <w:t xml:space="preserve"> </w:t>
       </w:r>
-      <w:hyperlink r:id="rId56">
+      <w:hyperlink r:id="rId55">
         <w:r>
           <w:rPr>
             <w:rStyle w:val="Hyperlink"/>
@@ -2218,7 +2208,7 @@
       <w:r>
         <w:t xml:space="preserve"> </w:t>
       </w:r>
-      <w:hyperlink r:id="rId57">
+      <w:hyperlink r:id="rId56">
         <w:r>
           <w:rPr>
             <w:rStyle w:val="Hyperlink"/>
@@ -2274,12 +2264,114 @@
       <w:r>
         <w:t xml:space="preserve"> </w:t>
       </w:r>
+      <w:hyperlink r:id="rId57">
+        <w:r>
+          <w:rPr>
+            <w:rStyle w:val="Hyperlink"/>
+          </w:rPr>
+          <w:t xml:space="preserve">“The Mind-Body Problem,”</w:t>
+        </w:r>
+        <w:r>
+          <w:rPr>
+            <w:rStyle w:val="Hyperlink"/>
+          </w:rPr>
+          <w:t xml:space="preserve"> </w:t>
+        </w:r>
+        <w:r>
+          <w:rPr>
+            <w:rStyle w:val="Hyperlink"/>
+          </w:rPr>
+          <w:t xml:space="preserve">the</w:t>
+        </w:r>
+        <w:r>
+          <w:rPr>
+            <w:rStyle w:val="Hyperlink"/>
+          </w:rPr>
+          <w:t xml:space="preserve"> </w:t>
+        </w:r>
+        <w:r>
+          <w:rPr>
+            <w:rStyle w:val="Hyperlink"/>
+          </w:rPr>
+          <w:t xml:space="preserve">“Varieties of Dualism”</w:t>
+        </w:r>
+        <w:r>
+          <w:rPr>
+            <w:rStyle w:val="Hyperlink"/>
+          </w:rPr>
+          <w:t xml:space="preserve"> </w:t>
+        </w:r>
+        <w:r>
+          <w:rPr>
+            <w:rStyle w:val="Hyperlink"/>
+          </w:rPr>
+          <w:t xml:space="preserve">section</w:t>
+        </w:r>
+      </w:hyperlink>
+      <w:r>
+        <w:t xml:space="preserve">.</w:t>
+      </w:r>
+      <w:r>
+        <w:br/>
+      </w:r>
+      <w:r>
+        <w:rPr>
+          <w:b/>
+          <w:bCs/>
+        </w:rPr>
+        <w:t xml:space="preserve">Recommended</w:t>
+      </w:r>
+      <w:r>
+        <w:t xml:space="preserve">: René Descartes</w:t>
+      </w:r>
+      <w:r>
+        <w:t xml:space="preserve"> </w:t>
+      </w:r>
       <w:hyperlink r:id="rId58">
         <w:r>
           <w:rPr>
             <w:rStyle w:val="Hyperlink"/>
           </w:rPr>
-          <w:t xml:space="preserve">“The Mind-Body Problem,”</w:t>
+          <w:t xml:space="preserve">Meditation VI</w:t>
+        </w:r>
+      </w:hyperlink>
+      <w:r>
+        <w:t xml:space="preserve">, translated by Jonathan Bennett.</w:t>
+      </w:r>
+    </w:p>
+    <w:bookmarkEnd w:id="59"/>
+    <w:bookmarkStart w:id="62" w:name="X0071eb8764b9615fa532bae8d3896a626f200f7"/>
+    <w:p>
+      <w:pPr>
+        <w:pStyle w:val="Heading3"/>
+      </w:pPr>
+      <w:r>
+        <w:t xml:space="preserve">Thursday, October 15 (Lecture 14) — The case against Dualism</w:t>
+      </w:r>
+    </w:p>
+    <w:p>
+      <w:pPr>
+        <w:pStyle w:val="FirstParagraph"/>
+      </w:pPr>
+      <w:r>
+        <w:rPr>
+          <w:b/>
+          <w:bCs/>
+        </w:rPr>
+        <w:t xml:space="preserve">Required</w:t>
+      </w:r>
+      <w:r>
+        <w:t xml:space="preserve">: Jacob Berger,</w:t>
+      </w:r>
+      <w:r>
+        <w:t xml:space="preserve"> </w:t>
+      </w:r>
+      <w:hyperlink r:id="rId57">
+        <w:r>
+          <w:rPr>
+            <w:rStyle w:val="Hyperlink"/>
+          </w:rPr>
+          <w:t xml:space="preserve">“The Mind-Body Problem: What Are Minds?”</w:t>
         </w:r>
         <w:r>
           <w:rPr>
@@ -2291,31 +2383,7 @@
           <w:rPr>
             <w:rStyle w:val="Hyperlink"/>
           </w:rPr>
-          <w:t xml:space="preserve">the</w:t>
-        </w:r>
-        <w:r>
-          <w:rPr>
-            <w:rStyle w:val="Hyperlink"/>
-          </w:rPr>
-          <w:t xml:space="preserve"> </w:t>
-        </w:r>
-        <w:r>
-          <w:rPr>
-            <w:rStyle w:val="Hyperlink"/>
-          </w:rPr>
-          <w:t xml:space="preserve">“Varieties of Dualism”</w:t>
-        </w:r>
-        <w:r>
-          <w:rPr>
-            <w:rStyle w:val="Hyperlink"/>
-          </w:rPr>
-          <w:t xml:space="preserve"> </w:t>
-        </w:r>
-        <w:r>
-          <w:rPr>
-            <w:rStyle w:val="Hyperlink"/>
-          </w:rPr>
-          <w:t xml:space="preserve">section</w:t>
+          <w:t xml:space="preserve">(1000-Word Philosophy)</w:t>
         </w:r>
       </w:hyperlink>
       <w:r>
@@ -2332,72 +2400,21 @@
         <w:t xml:space="preserve">Recommended</w:t>
       </w:r>
       <w:r>
-        <w:t xml:space="preserve">: René Descartes</w:t>
-      </w:r>
-      <w:r>
-        <w:t xml:space="preserve"> </w:t>
-      </w:r>
-      <w:hyperlink r:id="rId59">
-        <w:r>
-          <w:rPr>
-            <w:rStyle w:val="Hyperlink"/>
-          </w:rPr>
-          <w:t xml:space="preserve">Meditation VI</w:t>
-        </w:r>
-      </w:hyperlink>
-      <w:r>
-        <w:t xml:space="preserve">, translated by Jonathan Bennett.</w:t>
-      </w:r>
-    </w:p>
-    <w:bookmarkEnd w:id="60"/>
-    <w:bookmarkStart w:id="63" w:name="X0071eb8764b9615fa532bae8d3896a626f200f7"/>
-    <w:p>
-      <w:pPr>
-        <w:pStyle w:val="Heading3"/>
-      </w:pPr>
-      <w:r>
-        <w:t xml:space="preserve">Thursday, October 15 (Lecture 14) — The case against Dualism</w:t>
-      </w:r>
-    </w:p>
-    <w:p>
-      <w:pPr>
-        <w:pStyle w:val="FirstParagraph"/>
-      </w:pPr>
-      <w:r>
-        <w:rPr>
-          <w:b/>
-          <w:bCs/>
-        </w:rPr>
-        <w:t xml:space="preserve">Required</w:t>
-      </w:r>
-      <w:r>
-        <w:t xml:space="preserve">: Jacob Berger,</w:t>
-      </w:r>
-      <w:r>
-        <w:t xml:space="preserve"> </w:t>
-      </w:r>
-      <w:hyperlink r:id="rId58">
-        <w:r>
-          <w:rPr>
-            <w:rStyle w:val="Hyperlink"/>
-          </w:rPr>
-          <w:t xml:space="preserve">“The Mind-Body Problem: What Are Minds?”</w:t>
-        </w:r>
-        <w:r>
-          <w:rPr>
-            <w:rStyle w:val="Hyperlink"/>
-          </w:rPr>
-          <w:t xml:space="preserve"> </w:t>
-        </w:r>
-        <w:r>
-          <w:rPr>
-            <w:rStyle w:val="Hyperlink"/>
-          </w:rPr>
-          <w:t xml:space="preserve">(1000-Word Philosophy)</w:t>
-        </w:r>
-      </w:hyperlink>
-      <w:r>
-        <w:t xml:space="preserve">.</w:t>
+        <w:t xml:space="preserve">: Steven Schneider,</w:t>
+      </w:r>
+      <w:r>
+        <w:t xml:space="preserve"> </w:t>
+      </w:r>
+      <w:hyperlink r:id="rId60">
+        <w:r>
+          <w:rPr>
+            <w:rStyle w:val="Hyperlink"/>
+          </w:rPr>
+          <w:t xml:space="preserve">“Identity Theory”</w:t>
+        </w:r>
+      </w:hyperlink>
+      <w:r>
+        <w:t xml:space="preserve">, IEP, introduction.</w:t>
       </w:r>
       <w:r>
         <w:br/>
@@ -2410,39 +2427,12 @@
         <w:t xml:space="preserve">Recommended</w:t>
       </w:r>
       <w:r>
-        <w:t xml:space="preserve">: Steven Schneider,</w:t>
+        <w:t xml:space="preserve">: Princess Elisabeth of Bohemia and René Descartes,</w:t>
       </w:r>
       <w:r>
         <w:t xml:space="preserve"> </w:t>
       </w:r>
       <w:hyperlink r:id="rId61">
-        <w:r>
-          <w:rPr>
-            <w:rStyle w:val="Hyperlink"/>
-          </w:rPr>
-          <w:t xml:space="preserve">“Identity Theory”</w:t>
-        </w:r>
-      </w:hyperlink>
-      <w:r>
-        <w:t xml:space="preserve">, IEP, introduction.</w:t>
-      </w:r>
-      <w:r>
-        <w:br/>
-      </w:r>
-      <w:r>
-        <w:rPr>
-          <w:b/>
-          <w:bCs/>
-        </w:rPr>
-        <w:t xml:space="preserve">Recommended</w:t>
-      </w:r>
-      <w:r>
-        <w:t xml:space="preserve">: Princess Elisabeth of Bohemia and René Descartes,</w:t>
-      </w:r>
-      <w:r>
-        <w:t xml:space="preserve"> </w:t>
-      </w:r>
-      <w:hyperlink r:id="rId62">
         <w:r>
           <w:rPr>
             <w:rStyle w:val="Hyperlink"/>
@@ -2466,9 +2456,9 @@
         <w:t xml:space="preserve">Module Quiz 2 (Lectures 10–14) opens after class, due Sunday 1 November.</w:t>
       </w:r>
     </w:p>
+    <w:bookmarkEnd w:id="62"/>
     <w:bookmarkEnd w:id="63"/>
-    <w:bookmarkEnd w:id="64"/>
-    <w:bookmarkStart w:id="70" w:name="week-8-consequentialism"/>
+    <w:bookmarkStart w:id="69" w:name="week-8-consequentialism"/>
     <w:p>
       <w:pPr>
         <w:pStyle w:val="Heading2"/>
@@ -2489,7 +2479,7 @@
         <w:t xml:space="preserve">Short Answer 2 due Friday, October 23.</w:t>
       </w:r>
     </w:p>
-    <w:bookmarkStart w:id="65" w:name="X96837ae1114282219fbf9d652d877050467c741"/>
+    <w:bookmarkStart w:id="64" w:name="X96837ae1114282219fbf9d652d877050467c741"/>
     <w:p>
       <w:pPr>
         <w:pStyle w:val="Heading3"/>
@@ -2498,8 +2488,8 @@
         <w:t xml:space="preserve">Tuesday, October 20 — Fall Study Break, no class</w:t>
       </w:r>
     </w:p>
-    <w:bookmarkEnd w:id="65"/>
-    <w:bookmarkStart w:id="69" w:name="Xd0b8d34e58df369132c6104348308b4c66e51b4"/>
+    <w:bookmarkEnd w:id="64"/>
+    <w:bookmarkStart w:id="68" w:name="Xd0b8d34e58df369132c6104348308b4c66e51b4"/>
     <w:p>
       <w:pPr>
         <w:pStyle w:val="Heading3"/>
@@ -2525,37 +2515,37 @@
       <w:r>
         <w:t xml:space="preserve"> </w:t>
       </w:r>
+      <w:hyperlink r:id="rId65">
+        <w:r>
+          <w:rPr>
+            <w:rStyle w:val="Hyperlink"/>
+          </w:rPr>
+          <w:t xml:space="preserve">“Consequentialism and Utilitarianism”</w:t>
+        </w:r>
+      </w:hyperlink>
+      <w:r>
+        <w:t xml:space="preserve"> </w:t>
+      </w:r>
+      <w:r>
+        <w:t xml:space="preserve">(1000-Word Philosophy).</w:t>
+      </w:r>
+      <w:r>
+        <w:br/>
+      </w:r>
+      <w:r>
+        <w:rPr>
+          <w:b/>
+          <w:bCs/>
+        </w:rPr>
+        <w:t xml:space="preserve">Required</w:t>
+      </w:r>
+      <w:r>
+        <w:t xml:space="preserve">: J. S. Mill,</w:t>
+      </w:r>
+      <w:r>
+        <w:t xml:space="preserve"> </w:t>
+      </w:r>
       <w:hyperlink r:id="rId66">
-        <w:r>
-          <w:rPr>
-            <w:rStyle w:val="Hyperlink"/>
-          </w:rPr>
-          <w:t xml:space="preserve">“Consequentialism and Utilitarianism”</w:t>
-        </w:r>
-      </w:hyperlink>
-      <w:r>
-        <w:t xml:space="preserve"> </w:t>
-      </w:r>
-      <w:r>
-        <w:t xml:space="preserve">(1000-Word Philosophy).</w:t>
-      </w:r>
-      <w:r>
-        <w:br/>
-      </w:r>
-      <w:r>
-        <w:rPr>
-          <w:b/>
-          <w:bCs/>
-        </w:rPr>
-        <w:t xml:space="preserve">Required</w:t>
-      </w:r>
-      <w:r>
-        <w:t xml:space="preserve">: J. S. Mill,</w:t>
-      </w:r>
-      <w:r>
-        <w:t xml:space="preserve"> </w:t>
-      </w:r>
-      <w:hyperlink r:id="rId67">
         <w:r>
           <w:rPr>
             <w:rStyle w:val="Hyperlink"/>
@@ -2587,7 +2577,7 @@
       <w:r>
         <w:t xml:space="preserve"> </w:t>
       </w:r>
-      <w:hyperlink r:id="rId68">
+      <w:hyperlink r:id="rId67">
         <w:r>
           <w:rPr>
             <w:rStyle w:val="Hyperlink"/>
@@ -2618,9 +2608,9 @@
         <w:t xml:space="preserve">“Classic Utilitarianism.”</w:t>
       </w:r>
     </w:p>
+    <w:bookmarkEnd w:id="68"/>
     <w:bookmarkEnd w:id="69"/>
-    <w:bookmarkEnd w:id="70"/>
-    <w:bookmarkStart w:id="78" w:name="week-9-deontology-and-trolleys"/>
+    <w:bookmarkStart w:id="77" w:name="week-9-deontology-and-trolleys"/>
     <w:p>
       <w:pPr>
         <w:pStyle w:val="Heading2"/>
@@ -2629,7 +2619,7 @@
         <w:t xml:space="preserve">Week 9: Deontology and Trolleys</w:t>
       </w:r>
     </w:p>
-    <w:bookmarkStart w:id="74" w:name="tuesday-october-27-lecture-16-deontology"/>
+    <w:bookmarkStart w:id="73" w:name="tuesday-october-27-lecture-16-deontology"/>
     <w:p>
       <w:pPr>
         <w:pStyle w:val="Heading3"/>
@@ -2655,19 +2645,68 @@
       <w:r>
         <w:t xml:space="preserve"> </w:t>
       </w:r>
+      <w:hyperlink r:id="rId70">
+        <w:r>
+          <w:rPr>
+            <w:rStyle w:val="Hyperlink"/>
+          </w:rPr>
+          <w:t xml:space="preserve">“Deontology: Kantian Ethics”</w:t>
+        </w:r>
+      </w:hyperlink>
+      <w:r>
+        <w:t xml:space="preserve"> </w:t>
+      </w:r>
+      <w:r>
+        <w:t xml:space="preserve">(1000-Word Philosophy).</w:t>
+      </w:r>
+      <w:r>
+        <w:br/>
+      </w:r>
+      <w:r>
+        <w:rPr>
+          <w:b/>
+          <w:bCs/>
+        </w:rPr>
+        <w:t xml:space="preserve">Recommended</w:t>
+      </w:r>
+      <w:r>
+        <w:t xml:space="preserve">: Larry Alexander and Michael Moore,</w:t>
+      </w:r>
+      <w:r>
+        <w:t xml:space="preserve"> </w:t>
+      </w:r>
       <w:hyperlink r:id="rId71">
         <w:r>
           <w:rPr>
             <w:rStyle w:val="Hyperlink"/>
           </w:rPr>
-          <w:t xml:space="preserve">“Deontology: Kantian Ethics”</w:t>
-        </w:r>
-      </w:hyperlink>
-      <w:r>
-        <w:t xml:space="preserve"> </w:t>
-      </w:r>
-      <w:r>
-        <w:t xml:space="preserve">(1000-Word Philosophy).</w:t>
+          <w:t xml:space="preserve">“Deontological Ethics,”</w:t>
+        </w:r>
+      </w:hyperlink>
+      <w:r>
+        <w:t xml:space="preserve">, SEP,</w:t>
+      </w:r>
+      <w:r>
+        <w:t xml:space="preserve"> </w:t>
+      </w:r>
+      <w:r>
+        <w:rPr>
+          <w:b/>
+          <w:bCs/>
+        </w:rPr>
+        <w:t xml:space="preserve">§1</w:t>
+      </w:r>
+      <w:r>
+        <w:t xml:space="preserve">,</w:t>
+      </w:r>
+      <w:r>
+        <w:t xml:space="preserve"> </w:t>
+      </w:r>
+      <w:r>
+        <w:t xml:space="preserve">“Deontology’s Foil: Consequentialism”</w:t>
+      </w:r>
+      <w:r>
+        <w:t xml:space="preserve">.</w:t>
       </w:r>
       <w:r>
         <w:br/>
@@ -2680,61 +2719,12 @@
         <w:t xml:space="preserve">Recommended</w:t>
       </w:r>
       <w:r>
-        <w:t xml:space="preserve">: Larry Alexander and Michael Moore,</w:t>
+        <w:t xml:space="preserve">: Immanuel Kant,</w:t>
       </w:r>
       <w:r>
         <w:t xml:space="preserve"> </w:t>
       </w:r>
       <w:hyperlink r:id="rId72">
-        <w:r>
-          <w:rPr>
-            <w:rStyle w:val="Hyperlink"/>
-          </w:rPr>
-          <w:t xml:space="preserve">“Deontological Ethics,”</w:t>
-        </w:r>
-      </w:hyperlink>
-      <w:r>
-        <w:t xml:space="preserve">, SEP,</w:t>
-      </w:r>
-      <w:r>
-        <w:t xml:space="preserve"> </w:t>
-      </w:r>
-      <w:r>
-        <w:rPr>
-          <w:b/>
-          <w:bCs/>
-        </w:rPr>
-        <w:t xml:space="preserve">§1</w:t>
-      </w:r>
-      <w:r>
-        <w:t xml:space="preserve">,</w:t>
-      </w:r>
-      <w:r>
-        <w:t xml:space="preserve"> </w:t>
-      </w:r>
-      <w:r>
-        <w:t xml:space="preserve">“Deontology’s Foil: Consequentialism”</w:t>
-      </w:r>
-      <w:r>
-        <w:t xml:space="preserve">.</w:t>
-      </w:r>
-      <w:r>
-        <w:br/>
-      </w:r>
-      <w:r>
-        <w:rPr>
-          <w:b/>
-          <w:bCs/>
-        </w:rPr>
-        <w:t xml:space="preserve">Recommended</w:t>
-      </w:r>
-      <w:r>
-        <w:t xml:space="preserve">: Immanuel Kant,</w:t>
-      </w:r>
-      <w:r>
-        <w:t xml:space="preserve"> </w:t>
-      </w:r>
-      <w:hyperlink r:id="rId73">
         <w:r>
           <w:rPr>
             <w:rStyle w:val="Hyperlink"/>
@@ -2748,8 +2738,8 @@
         <w:t xml:space="preserve">, translated by Jonathan Bennett, Chapter 1, especially the opening on the good will and the passages on universal law.</w:t>
       </w:r>
     </w:p>
-    <w:bookmarkEnd w:id="74"/>
-    <w:bookmarkStart w:id="77" w:name="Xf9503ef139db4d04bbf75454be19f247653d6bf"/>
+    <w:bookmarkEnd w:id="73"/>
+    <w:bookmarkStart w:id="76" w:name="Xf9503ef139db4d04bbf75454be19f247653d6bf"/>
     <w:p>
       <w:pPr>
         <w:pStyle w:val="Heading3"/>
@@ -2775,19 +2765,95 @@
       <w:r>
         <w:t xml:space="preserve"> </w:t>
       </w:r>
+      <w:hyperlink r:id="rId74">
+        <w:r>
+          <w:rPr>
+            <w:rStyle w:val="Hyperlink"/>
+          </w:rPr>
+          <w:t xml:space="preserve">“The Doctrine of Double Effect”</w:t>
+        </w:r>
+      </w:hyperlink>
+      <w:r>
+        <w:t xml:space="preserve"> </w:t>
+      </w:r>
+      <w:r>
+        <w:t xml:space="preserve">(1000-Word Philosophy).</w:t>
+      </w:r>
+      <w:r>
+        <w:br/>
+      </w:r>
+      <w:r>
+        <w:rPr>
+          <w:b/>
+          <w:bCs/>
+        </w:rPr>
+        <w:t xml:space="preserve">Required</w:t>
+      </w:r>
+      <w:r>
+        <w:t xml:space="preserve">: Judith Jarvis Thomson,</w:t>
+      </w:r>
+      <w:r>
+        <w:t xml:space="preserve"> </w:t>
+      </w:r>
       <w:hyperlink r:id="rId75">
         <w:r>
           <w:rPr>
             <w:rStyle w:val="Hyperlink"/>
           </w:rPr>
-          <w:t xml:space="preserve">“The Doctrine of Double Effect”</w:t>
-        </w:r>
-      </w:hyperlink>
-      <w:r>
-        <w:t xml:space="preserve"> </w:t>
-      </w:r>
-      <w:r>
-        <w:t xml:space="preserve">(1000-Word Philosophy).</w:t>
+          <w:t xml:space="preserve">“The Trolley Problem”</w:t>
+        </w:r>
+      </w:hyperlink>
+      <w:r>
+        <w:t xml:space="preserve">, sections I and II.</w:t>
+      </w:r>
+    </w:p>
+    <w:bookmarkEnd w:id="76"/>
+    <w:bookmarkEnd w:id="77"/>
+    <w:bookmarkStart w:id="84" w:name="week-10-what-makes-a-life-go-well"/>
+    <w:p>
+      <w:pPr>
+        <w:pStyle w:val="Heading2"/>
+      </w:pPr>
+      <w:r>
+        <w:t xml:space="preserve">Week 10: What Makes a Life Go Well</w:t>
+      </w:r>
+    </w:p>
+    <w:bookmarkStart w:id="80" w:name="Xfa27847b8ca2d7448cd55c9f9be995321b42872"/>
+    <w:p>
+      <w:pPr>
+        <w:pStyle w:val="Heading3"/>
+      </w:pPr>
+      <w:r>
+        <w:t xml:space="preserve">Tuesday, November 03 (Lecture 18) — What is welfare?</w:t>
+      </w:r>
+    </w:p>
+    <w:p>
+      <w:pPr>
+        <w:pStyle w:val="FirstParagraph"/>
+      </w:pPr>
+      <w:r>
+        <w:rPr>
+          <w:b/>
+          <w:bCs/>
+        </w:rPr>
+        <w:t xml:space="preserve">Required</w:t>
+      </w:r>
+      <w:r>
+        <w:t xml:space="preserve">: Richard Y. Chappell and Darius Meissner,</w:t>
+      </w:r>
+      <w:r>
+        <w:t xml:space="preserve"> </w:t>
+      </w:r>
+      <w:hyperlink r:id="rId78">
+        <w:r>
+          <w:rPr>
+            <w:rStyle w:val="Hyperlink"/>
+          </w:rPr>
+          <w:t xml:space="preserve">“Theories of Well-Being”</w:t>
+        </w:r>
+      </w:hyperlink>
+      <w:r>
+        <w:t xml:space="preserve">, the introduction.</w:t>
       </w:r>
       <w:r>
         <w:br/>
@@ -2800,41 +2866,50 @@
         <w:t xml:space="preserve">Required</w:t>
       </w:r>
       <w:r>
-        <w:t xml:space="preserve">: Judith Jarvis Thomson,</w:t>
-      </w:r>
-      <w:r>
-        <w:t xml:space="preserve"> </w:t>
-      </w:r>
-      <w:hyperlink r:id="rId76">
-        <w:r>
-          <w:rPr>
-            <w:rStyle w:val="Hyperlink"/>
-          </w:rPr>
-          <w:t xml:space="preserve">“The Trolley Problem”</w:t>
-        </w:r>
-      </w:hyperlink>
-      <w:r>
-        <w:t xml:space="preserve">, sections I and II.</w:t>
-      </w:r>
-    </w:p>
-    <w:bookmarkEnd w:id="77"/>
-    <w:bookmarkEnd w:id="78"/>
-    <w:bookmarkStart w:id="85" w:name="week-10-what-makes-a-life-go-well"/>
-    <w:p>
-      <w:pPr>
-        <w:pStyle w:val="Heading2"/>
-      </w:pPr>
-      <w:r>
-        <w:t xml:space="preserve">Week 10: What Makes a Life Go Well</w:t>
-      </w:r>
-    </w:p>
-    <w:bookmarkStart w:id="81" w:name="Xfa27847b8ca2d7448cd55c9f9be995321b42872"/>
+        <w:t xml:space="preserve">: Roger Crisp,</w:t>
+      </w:r>
+      <w:r>
+        <w:t xml:space="preserve"> </w:t>
+      </w:r>
+      <w:hyperlink r:id="rId79">
+        <w:r>
+          <w:rPr>
+            <w:rStyle w:val="Hyperlink"/>
+          </w:rPr>
+          <w:t xml:space="preserve">“Well-Being”</w:t>
+        </w:r>
+      </w:hyperlink>
+      <w:r>
+        <w:t xml:space="preserve">, SEP,</w:t>
+      </w:r>
+      <w:r>
+        <w:t xml:space="preserve"> </w:t>
+      </w:r>
+      <w:r>
+        <w:rPr>
+          <w:b/>
+          <w:bCs/>
+        </w:rPr>
+        <w:t xml:space="preserve">§1</w:t>
+      </w:r>
+      <w:r>
+        <w:t xml:space="preserve">,</w:t>
+      </w:r>
+      <w:r>
+        <w:t xml:space="preserve"> </w:t>
+      </w:r>
+      <w:r>
+        <w:t xml:space="preserve">“The Concept.”</w:t>
+      </w:r>
+    </w:p>
+    <w:bookmarkEnd w:id="80"/>
+    <w:bookmarkStart w:id="83" w:name="thursday-november-05-lecture-19-hedonism"/>
     <w:p>
       <w:pPr>
         <w:pStyle w:val="Heading3"/>
       </w:pPr>
       <w:r>
-        <w:t xml:space="preserve">Tuesday, November 03 (Lecture 18) — What is welfare?</w:t>
+        <w:t xml:space="preserve">Thursday, November 05 (Lecture 19) — Hedonism</w:t>
       </w:r>
     </w:p>
     <w:p>
@@ -2849,21 +2924,40 @@
         <w:t xml:space="preserve">Required</w:t>
       </w:r>
       <w:r>
-        <w:t xml:space="preserve">: Richard Y. Chappell and Darius Meissner,</w:t>
-      </w:r>
-      <w:r>
-        <w:t xml:space="preserve"> </w:t>
-      </w:r>
-      <w:hyperlink r:id="rId79">
-        <w:r>
-          <w:rPr>
-            <w:rStyle w:val="Hyperlink"/>
-          </w:rPr>
-          <w:t xml:space="preserve">“Theories of Well-Being”</w:t>
-        </w:r>
-      </w:hyperlink>
-      <w:r>
-        <w:t xml:space="preserve">, the introduction.</w:t>
+        <w:t xml:space="preserve">: Roger Crisp,</w:t>
+      </w:r>
+      <w:r>
+        <w:t xml:space="preserve"> </w:t>
+      </w:r>
+      <w:hyperlink r:id="rId81">
+        <w:r>
+          <w:rPr>
+            <w:rStyle w:val="Hyperlink"/>
+          </w:rPr>
+          <w:t xml:space="preserve">“Well-Being”</w:t>
+        </w:r>
+      </w:hyperlink>
+      <w:r>
+        <w:t xml:space="preserve">, SEP,</w:t>
+      </w:r>
+      <w:r>
+        <w:t xml:space="preserve"> </w:t>
+      </w:r>
+      <w:r>
+        <w:rPr>
+          <w:b/>
+          <w:bCs/>
+        </w:rPr>
+        <w:t xml:space="preserve">§4.1</w:t>
+      </w:r>
+      <w:r>
+        <w:t xml:space="preserve">,</w:t>
+      </w:r>
+      <w:r>
+        <w:t xml:space="preserve"> </w:t>
+      </w:r>
+      <w:r>
+        <w:t xml:space="preserve">“Hedonism.”</w:t>
       </w:r>
       <w:r>
         <w:br/>
@@ -2876,116 +2970,12 @@
         <w:t xml:space="preserve">Required</w:t>
       </w:r>
       <w:r>
-        <w:t xml:space="preserve">: Roger Crisp,</w:t>
-      </w:r>
-      <w:r>
-        <w:t xml:space="preserve"> </w:t>
-      </w:r>
-      <w:hyperlink r:id="rId80">
-        <w:r>
-          <w:rPr>
-            <w:rStyle w:val="Hyperlink"/>
-          </w:rPr>
-          <w:t xml:space="preserve">“Well-Being”</w:t>
-        </w:r>
-      </w:hyperlink>
-      <w:r>
-        <w:t xml:space="preserve">, SEP,</w:t>
-      </w:r>
-      <w:r>
-        <w:t xml:space="preserve"> </w:t>
-      </w:r>
-      <w:r>
-        <w:rPr>
-          <w:b/>
-          <w:bCs/>
-        </w:rPr>
-        <w:t xml:space="preserve">§1</w:t>
-      </w:r>
-      <w:r>
-        <w:t xml:space="preserve">,</w:t>
-      </w:r>
-      <w:r>
-        <w:t xml:space="preserve"> </w:t>
-      </w:r>
-      <w:r>
-        <w:t xml:space="preserve">“The Concept.”</w:t>
-      </w:r>
-    </w:p>
-    <w:bookmarkEnd w:id="81"/>
-    <w:bookmarkStart w:id="84" w:name="thursday-november-05-lecture-19-hedonism"/>
-    <w:p>
-      <w:pPr>
-        <w:pStyle w:val="Heading3"/>
-      </w:pPr>
-      <w:r>
-        <w:t xml:space="preserve">Thursday, November 05 (Lecture 19) — Hedonism</w:t>
-      </w:r>
-    </w:p>
-    <w:p>
-      <w:pPr>
-        <w:pStyle w:val="FirstParagraph"/>
-      </w:pPr>
-      <w:r>
-        <w:rPr>
-          <w:b/>
-          <w:bCs/>
-        </w:rPr>
-        <w:t xml:space="preserve">Required</w:t>
-      </w:r>
-      <w:r>
-        <w:t xml:space="preserve">: Roger Crisp,</w:t>
+        <w:t xml:space="preserve">: Robert Nozick,</w:t>
       </w:r>
       <w:r>
         <w:t xml:space="preserve"> </w:t>
       </w:r>
       <w:hyperlink r:id="rId82">
-        <w:r>
-          <w:rPr>
-            <w:rStyle w:val="Hyperlink"/>
-          </w:rPr>
-          <w:t xml:space="preserve">“Well-Being”</w:t>
-        </w:r>
-      </w:hyperlink>
-      <w:r>
-        <w:t xml:space="preserve">, SEP,</w:t>
-      </w:r>
-      <w:r>
-        <w:t xml:space="preserve"> </w:t>
-      </w:r>
-      <w:r>
-        <w:rPr>
-          <w:b/>
-          <w:bCs/>
-        </w:rPr>
-        <w:t xml:space="preserve">§4.1</w:t>
-      </w:r>
-      <w:r>
-        <w:t xml:space="preserve">,</w:t>
-      </w:r>
-      <w:r>
-        <w:t xml:space="preserve"> </w:t>
-      </w:r>
-      <w:r>
-        <w:t xml:space="preserve">“Hedonism.”</w:t>
-      </w:r>
-      <w:r>
-        <w:br/>
-      </w:r>
-      <w:r>
-        <w:rPr>
-          <w:b/>
-          <w:bCs/>
-        </w:rPr>
-        <w:t xml:space="preserve">Required</w:t>
-      </w:r>
-      <w:r>
-        <w:t xml:space="preserve">: Robert Nozick,</w:t>
-      </w:r>
-      <w:r>
-        <w:t xml:space="preserve"> </w:t>
-      </w:r>
-      <w:hyperlink r:id="rId83">
         <w:r>
           <w:rPr>
             <w:rStyle w:val="Hyperlink"/>
@@ -3015,9 +3005,9 @@
         <w:t xml:space="preserve">(AGAIN, IT MIGHT BE BEST TO DISTRIBUTE ESSAY QUESTIONS EARLIER)</w:t>
       </w:r>
     </w:p>
+    <w:bookmarkEnd w:id="83"/>
     <w:bookmarkEnd w:id="84"/>
-    <w:bookmarkEnd w:id="85"/>
-    <w:bookmarkStart w:id="92" w:name="week-11-desire-and-the-objective-list"/>
+    <w:bookmarkStart w:id="91" w:name="week-11-desire-and-the-objective-list"/>
     <w:p>
       <w:pPr>
         <w:pStyle w:val="Heading2"/>
@@ -3026,7 +3016,7 @@
         <w:t xml:space="preserve">Week 11: Desire, and the Objective List</w:t>
       </w:r>
     </w:p>
-    <w:bookmarkStart w:id="87" w:name="X79631354aa8d6bc57231d28d4dc4739aa6c34da"/>
+    <w:bookmarkStart w:id="86" w:name="X79631354aa8d6bc57231d28d4dc4739aa6c34da"/>
     <w:p>
       <w:pPr>
         <w:pStyle w:val="Heading3"/>
@@ -3052,7 +3042,7 @@
       <w:r>
         <w:t xml:space="preserve"> </w:t>
       </w:r>
-      <w:hyperlink r:id="rId86">
+      <w:hyperlink r:id="rId85">
         <w:r>
           <w:rPr>
             <w:rStyle w:val="Hyperlink"/>
@@ -3101,32 +3091,78 @@
       <w:r>
         <w:t xml:space="preserve"> </w:t>
       </w:r>
+      <w:hyperlink r:id="rId78">
+        <w:r>
+          <w:rPr>
+            <w:rStyle w:val="Hyperlink"/>
+          </w:rPr>
+          <w:t xml:space="preserve">“Theories of Well-Being”</w:t>
+        </w:r>
+      </w:hyperlink>
+      <w:r>
+        <w:t xml:space="preserve">, the desire-theory section.</w:t>
+      </w:r>
+    </w:p>
+    <w:bookmarkEnd w:id="86"/>
+    <w:bookmarkStart w:id="90" w:name="X10a570f0a704e9c5b54652dbcd8cc810abb2eca"/>
+    <w:p>
+      <w:pPr>
+        <w:pStyle w:val="Heading3"/>
+      </w:pPr>
+      <w:r>
+        <w:t xml:space="preserve">Thursday, November 12 (Lecture 21) — Objective lists, and who has a welfare</w:t>
+      </w:r>
+    </w:p>
+    <w:p>
+      <w:pPr>
+        <w:pStyle w:val="FirstParagraph"/>
+      </w:pPr>
+      <w:r>
+        <w:rPr>
+          <w:b/>
+          <w:bCs/>
+        </w:rPr>
+        <w:t xml:space="preserve">Required</w:t>
+      </w:r>
+      <w:r>
+        <w:t xml:space="preserve">: Roger Crisp,</w:t>
+      </w:r>
+      <w:r>
+        <w:t xml:space="preserve"> </w:t>
+      </w:r>
       <w:hyperlink r:id="rId79">
         <w:r>
           <w:rPr>
             <w:rStyle w:val="Hyperlink"/>
           </w:rPr>
-          <w:t xml:space="preserve">“Theories of Well-Being”</w:t>
-        </w:r>
-      </w:hyperlink>
-      <w:r>
-        <w:t xml:space="preserve">, the desire-theory section.</w:t>
-      </w:r>
-    </w:p>
-    <w:bookmarkEnd w:id="87"/>
-    <w:bookmarkStart w:id="91" w:name="X10a570f0a704e9c5b54652dbcd8cc810abb2eca"/>
-    <w:p>
-      <w:pPr>
-        <w:pStyle w:val="Heading3"/>
-      </w:pPr>
-      <w:r>
-        <w:t xml:space="preserve">Thursday, November 12 (Lecture 21) — Objective lists, and who has a welfare</w:t>
-      </w:r>
-    </w:p>
-    <w:p>
-      <w:pPr>
-        <w:pStyle w:val="FirstParagraph"/>
-      </w:pPr>
+          <w:t xml:space="preserve">“Well-Being”</w:t>
+        </w:r>
+      </w:hyperlink>
+      <w:r>
+        <w:t xml:space="preserve">, SEP,</w:t>
+      </w:r>
+      <w:r>
+        <w:t xml:space="preserve"> </w:t>
+      </w:r>
+      <w:r>
+        <w:rPr>
+          <w:b/>
+          <w:bCs/>
+        </w:rPr>
+        <w:t xml:space="preserve">§4.3</w:t>
+      </w:r>
+      <w:r>
+        <w:t xml:space="preserve">,</w:t>
+      </w:r>
+      <w:r>
+        <w:t xml:space="preserve"> </w:t>
+      </w:r>
+      <w:r>
+        <w:t xml:space="preserve">“Objective List Theories.”</w:t>
+      </w:r>
+      <w:r>
+        <w:br/>
+      </w:r>
       <w:r>
         <w:rPr>
           <w:b/>
@@ -3135,17 +3171,17 @@
         <w:t xml:space="preserve">Required</w:t>
       </w:r>
       <w:r>
-        <w:t xml:space="preserve">: Roger Crisp,</w:t>
-      </w:r>
-      <w:r>
-        <w:t xml:space="preserve"> </w:t>
-      </w:r>
-      <w:hyperlink r:id="rId80">
-        <w:r>
-          <w:rPr>
-            <w:rStyle w:val="Hyperlink"/>
-          </w:rPr>
-          <w:t xml:space="preserve">“Well-Being”</w:t>
+        <w:t xml:space="preserve">: Lori Gruen and Susana Monsó,</w:t>
+      </w:r>
+      <w:r>
+        <w:t xml:space="preserve"> </w:t>
+      </w:r>
+      <w:hyperlink r:id="rId87">
+        <w:r>
+          <w:rPr>
+            <w:rStyle w:val="Hyperlink"/>
+          </w:rPr>
+          <w:t xml:space="preserve">“The Moral Status of Animals”</w:t>
         </w:r>
       </w:hyperlink>
       <w:r>
@@ -3159,7 +3195,7 @@
           <w:b/>
           <w:bCs/>
         </w:rPr>
-        <w:t xml:space="preserve">§4.3</w:t>
+        <w:t xml:space="preserve">§1.1</w:t>
       </w:r>
       <w:r>
         <w:t xml:space="preserve">,</w:t>
@@ -3168,7 +3204,35 @@
         <w:t xml:space="preserve"> </w:t>
       </w:r>
       <w:r>
-        <w:t xml:space="preserve">“Objective List Theories.”</w:t>
+        <w:t xml:space="preserve">“Speciesism”</w:t>
+      </w:r>
+      <w:r>
+        <w:t xml:space="preserve"> </w:t>
+      </w:r>
+      <w:r>
+        <w:t xml:space="preserve">and</w:t>
+      </w:r>
+      <w:r>
+        <w:t xml:space="preserve"> </w:t>
+      </w:r>
+      <w:r>
+        <w:rPr>
+          <w:b/>
+          <w:bCs/>
+        </w:rPr>
+        <w:t xml:space="preserve">§1.4</w:t>
+      </w:r>
+      <w:r>
+        <w:t xml:space="preserve">,</w:t>
+      </w:r>
+      <w:r>
+        <w:t xml:space="preserve"> </w:t>
+      </w:r>
+      <w:r>
+        <w:t xml:space="preserve">“Sentience”</w:t>
+      </w:r>
+      <w:r>
+        <w:t xml:space="preserve">.</w:t>
       </w:r>
       <w:r>
         <w:br/>
@@ -3178,89 +3242,15 @@
           <w:b/>
           <w:bCs/>
         </w:rPr>
-        <w:t xml:space="preserve">Required</w:t>
-      </w:r>
-      <w:r>
-        <w:t xml:space="preserve">: Lori Gruen and Susana Monsó,</w:t>
+        <w:t xml:space="preserve">Recommended</w:t>
+      </w:r>
+      <w:r>
+        <w:t xml:space="preserve">: Conor Purcell,</w:t>
       </w:r>
       <w:r>
         <w:t xml:space="preserve"> </w:t>
       </w:r>
       <w:hyperlink r:id="rId88">
-        <w:r>
-          <w:rPr>
-            <w:rStyle w:val="Hyperlink"/>
-          </w:rPr>
-          <w:t xml:space="preserve">“The Moral Status of Animals”</w:t>
-        </w:r>
-      </w:hyperlink>
-      <w:r>
-        <w:t xml:space="preserve">, SEP,</w:t>
-      </w:r>
-      <w:r>
-        <w:t xml:space="preserve"> </w:t>
-      </w:r>
-      <w:r>
-        <w:rPr>
-          <w:b/>
-          <w:bCs/>
-        </w:rPr>
-        <w:t xml:space="preserve">§1.1</w:t>
-      </w:r>
-      <w:r>
-        <w:t xml:space="preserve">,</w:t>
-      </w:r>
-      <w:r>
-        <w:t xml:space="preserve"> </w:t>
-      </w:r>
-      <w:r>
-        <w:t xml:space="preserve">“Speciesism”</w:t>
-      </w:r>
-      <w:r>
-        <w:t xml:space="preserve"> </w:t>
-      </w:r>
-      <w:r>
-        <w:t xml:space="preserve">and</w:t>
-      </w:r>
-      <w:r>
-        <w:t xml:space="preserve"> </w:t>
-      </w:r>
-      <w:r>
-        <w:rPr>
-          <w:b/>
-          <w:bCs/>
-        </w:rPr>
-        <w:t xml:space="preserve">§1.4</w:t>
-      </w:r>
-      <w:r>
-        <w:t xml:space="preserve">,</w:t>
-      </w:r>
-      <w:r>
-        <w:t xml:space="preserve"> </w:t>
-      </w:r>
-      <w:r>
-        <w:t xml:space="preserve">“Sentience”</w:t>
-      </w:r>
-      <w:r>
-        <w:t xml:space="preserve">.</w:t>
-      </w:r>
-      <w:r>
-        <w:br/>
-      </w:r>
-      <w:r>
-        <w:rPr>
-          <w:b/>
-          <w:bCs/>
-        </w:rPr>
-        <w:t xml:space="preserve">Recommended</w:t>
-      </w:r>
-      <w:r>
-        <w:t xml:space="preserve">: Conor Purcell,</w:t>
-      </w:r>
-      <w:r>
-        <w:t xml:space="preserve"> </w:t>
-      </w:r>
-      <w:hyperlink r:id="rId89">
         <w:r>
           <w:rPr>
             <w:rStyle w:val="Hyperlink"/>
@@ -3300,7 +3290,7 @@
       <w:r>
         <w:t xml:space="preserve"> </w:t>
       </w:r>
-      <w:hyperlink r:id="rId90">
+      <w:hyperlink r:id="rId89">
         <w:r>
           <w:rPr>
             <w:rStyle w:val="Hyperlink"/>
@@ -3337,9 +3327,9 @@
         <w:t xml:space="preserve">Module Quiz 3 (Lectures 15–21) opens after class.</w:t>
       </w:r>
     </w:p>
+    <w:bookmarkEnd w:id="90"/>
     <w:bookmarkEnd w:id="91"/>
-    <w:bookmarkEnd w:id="92"/>
-    <w:bookmarkStart w:id="101" w:name="week-12-the-self"/>
+    <w:bookmarkStart w:id="100" w:name="week-12-the-self"/>
     <w:p>
       <w:pPr>
         <w:pStyle w:val="Heading2"/>
@@ -3348,7 +3338,7 @@
         <w:t xml:space="preserve">Week 12: The Self</w:t>
       </w:r>
     </w:p>
-    <w:bookmarkStart w:id="96" w:name="Xd41dee43ab2ae7aade769c2c5526b30fecfa0af"/>
+    <w:bookmarkStart w:id="95" w:name="Xd41dee43ab2ae7aade769c2c5526b30fecfa0af"/>
     <w:p>
       <w:pPr>
         <w:pStyle w:val="Heading3"/>
@@ -3374,12 +3364,69 @@
       <w:r>
         <w:t xml:space="preserve"> </w:t>
       </w:r>
+      <w:hyperlink r:id="rId92">
+        <w:r>
+          <w:rPr>
+            <w:rStyle w:val="Hyperlink"/>
+          </w:rPr>
+          <w:t xml:space="preserve">“Psychological Approaches to Personal Identity”</w:t>
+        </w:r>
+      </w:hyperlink>
+      <w:r>
+        <w:t xml:space="preserve"> </w:t>
+      </w:r>
+      <w:r>
+        <w:t xml:space="preserve">(1000-Word Philosophy).</w:t>
+      </w:r>
+      <w:r>
+        <w:br/>
+      </w:r>
+      <w:r>
+        <w:rPr>
+          <w:b/>
+          <w:bCs/>
+        </w:rPr>
+        <w:t xml:space="preserve">Required</w:t>
+      </w:r>
+      <w:r>
+        <w:t xml:space="preserve">: Derek Parfit,</w:t>
+      </w:r>
+      <w:r>
+        <w:t xml:space="preserve"> </w:t>
+      </w:r>
       <w:hyperlink r:id="rId93">
         <w:r>
           <w:rPr>
             <w:rStyle w:val="Hyperlink"/>
           </w:rPr>
-          <w:t xml:space="preserve">“Psychological Approaches to Personal Identity”</w:t>
+          <w:t xml:space="preserve">“Divided Minds and the Nature of Persons”</w:t>
+        </w:r>
+      </w:hyperlink>
+      <w:r>
+        <w:t xml:space="preserve">.</w:t>
+      </w:r>
+      <w:r>
+        <w:br/>
+      </w:r>
+      <w:r>
+        <w:rPr>
+          <w:b/>
+          <w:bCs/>
+        </w:rPr>
+        <w:t xml:space="preserve">Recommended</w:t>
+      </w:r>
+      <w:r>
+        <w:t xml:space="preserve">: Chad Vance,</w:t>
+      </w:r>
+      <w:r>
+        <w:t xml:space="preserve"> </w:t>
+      </w:r>
+      <w:hyperlink r:id="rId94">
+        <w:r>
+          <w:rPr>
+            <w:rStyle w:val="Hyperlink"/>
+          </w:rPr>
+          <w:t xml:space="preserve">“Personal Identity: How We Exist Over Time”</w:t>
         </w:r>
       </w:hyperlink>
       <w:r>
@@ -3388,9 +3435,21 @@
       <w:r>
         <w:t xml:space="preserve">(1000-Word Philosophy).</w:t>
       </w:r>
-      <w:r>
-        <w:br/>
-      </w:r>
+    </w:p>
+    <w:bookmarkEnd w:id="95"/>
+    <w:bookmarkStart w:id="99" w:name="X7b137362c18c82fd08f57a4d05c8acf900f9e5f"/>
+    <w:p>
+      <w:pPr>
+        <w:pStyle w:val="Heading3"/>
+      </w:pPr>
+      <w:r>
+        <w:t xml:space="preserve">Thursday, November 19 (Lecture 23) — What matters in survival</w:t>
+      </w:r>
+    </w:p>
+    <w:p>
+      <w:pPr>
+        <w:pStyle w:val="FirstParagraph"/>
+      </w:pPr>
       <w:r>
         <w:rPr>
           <w:b/>
@@ -3399,81 +3458,12 @@
         <w:t xml:space="preserve">Required</w:t>
       </w:r>
       <w:r>
-        <w:t xml:space="preserve">: Derek Parfit,</w:t>
-      </w:r>
-      <w:r>
-        <w:t xml:space="preserve"> </w:t>
-      </w:r>
-      <w:hyperlink r:id="rId94">
-        <w:r>
-          <w:rPr>
-            <w:rStyle w:val="Hyperlink"/>
-          </w:rPr>
-          <w:t xml:space="preserve">“Divided Minds and the Nature of Persons”</w:t>
-        </w:r>
-      </w:hyperlink>
-      <w:r>
-        <w:t xml:space="preserve">.</w:t>
-      </w:r>
-      <w:r>
-        <w:br/>
-      </w:r>
-      <w:r>
-        <w:rPr>
-          <w:b/>
-          <w:bCs/>
-        </w:rPr>
-        <w:t xml:space="preserve">Recommended</w:t>
-      </w:r>
-      <w:r>
-        <w:t xml:space="preserve">: Chad Vance,</w:t>
-      </w:r>
-      <w:r>
-        <w:t xml:space="preserve"> </w:t>
-      </w:r>
-      <w:hyperlink r:id="rId95">
-        <w:r>
-          <w:rPr>
-            <w:rStyle w:val="Hyperlink"/>
-          </w:rPr>
-          <w:t xml:space="preserve">“Personal Identity: How We Exist Over Time”</w:t>
-        </w:r>
-      </w:hyperlink>
-      <w:r>
-        <w:t xml:space="preserve"> </w:t>
-      </w:r>
-      <w:r>
-        <w:t xml:space="preserve">(1000-Word Philosophy).</w:t>
-      </w:r>
-    </w:p>
-    <w:bookmarkEnd w:id="96"/>
-    <w:bookmarkStart w:id="100" w:name="X7b137362c18c82fd08f57a4d05c8acf900f9e5f"/>
-    <w:p>
-      <w:pPr>
-        <w:pStyle w:val="Heading3"/>
-      </w:pPr>
-      <w:r>
-        <w:t xml:space="preserve">Thursday, November 19 (Lecture 23) — What matters in survival</w:t>
-      </w:r>
-    </w:p>
-    <w:p>
-      <w:pPr>
-        <w:pStyle w:val="FirstParagraph"/>
-      </w:pPr>
-      <w:r>
-        <w:rPr>
-          <w:b/>
-          <w:bCs/>
-        </w:rPr>
-        <w:t xml:space="preserve">Required</w:t>
-      </w:r>
-      <w:r>
         <w:t xml:space="preserve">: John Locke,</w:t>
       </w:r>
       <w:r>
         <w:t xml:space="preserve"> </w:t>
       </w:r>
-      <w:hyperlink r:id="rId97">
+      <w:hyperlink r:id="rId96">
         <w:r>
           <w:rPr>
             <w:rStyle w:val="Hyperlink"/>
@@ -3508,37 +3498,37 @@
       <w:r>
         <w:t xml:space="preserve"> </w:t>
       </w:r>
+      <w:hyperlink r:id="rId97">
+        <w:r>
+          <w:rPr>
+            <w:rStyle w:val="Hyperlink"/>
+          </w:rPr>
+          <w:t xml:space="preserve">“The Buddhist Theory of No-Self”</w:t>
+        </w:r>
+      </w:hyperlink>
+      <w:r>
+        <w:t xml:space="preserve"> </w:t>
+      </w:r>
+      <w:r>
+        <w:t xml:space="preserve">(1000-Word Philosophy).</w:t>
+      </w:r>
+      <w:r>
+        <w:br/>
+      </w:r>
+      <w:r>
+        <w:rPr>
+          <w:b/>
+          <w:bCs/>
+        </w:rPr>
+        <w:t xml:space="preserve">Required</w:t>
+      </w:r>
+      <w:r>
+        <w:t xml:space="preserve">: Jessica Gordon-Roth,</w:t>
+      </w:r>
+      <w:r>
+        <w:t xml:space="preserve"> </w:t>
+      </w:r>
       <w:hyperlink r:id="rId98">
-        <w:r>
-          <w:rPr>
-            <w:rStyle w:val="Hyperlink"/>
-          </w:rPr>
-          <w:t xml:space="preserve">“The Buddhist Theory of No-Self”</w:t>
-        </w:r>
-      </w:hyperlink>
-      <w:r>
-        <w:t xml:space="preserve"> </w:t>
-      </w:r>
-      <w:r>
-        <w:t xml:space="preserve">(1000-Word Philosophy).</w:t>
-      </w:r>
-      <w:r>
-        <w:br/>
-      </w:r>
-      <w:r>
-        <w:rPr>
-          <w:b/>
-          <w:bCs/>
-        </w:rPr>
-        <w:t xml:space="preserve">Required</w:t>
-      </w:r>
-      <w:r>
-        <w:t xml:space="preserve">: Jessica Gordon-Roth,</w:t>
-      </w:r>
-      <w:r>
-        <w:t xml:space="preserve"> </w:t>
-      </w:r>
-      <w:hyperlink r:id="rId99">
         <w:r>
           <w:rPr>
             <w:rStyle w:val="Hyperlink"/>
@@ -3597,7 +3587,7 @@
       <w:r>
         <w:t xml:space="preserve"> </w:t>
       </w:r>
-      <w:hyperlink r:id="rId97">
+      <w:hyperlink r:id="rId96">
         <w:r>
           <w:rPr>
             <w:rStyle w:val="Hyperlink"/>
@@ -3617,9 +3607,9 @@
         <w:t xml:space="preserve">, all of Chapter xxvii, for anyone who wants to see the details of Locke’s view in a more original form.</w:t>
       </w:r>
     </w:p>
+    <w:bookmarkEnd w:id="99"/>
     <w:bookmarkEnd w:id="100"/>
-    <w:bookmarkEnd w:id="101"/>
-    <w:bookmarkStart w:id="106" w:name="week-13-law"/>
+    <w:bookmarkStart w:id="105" w:name="week-13-law"/>
     <w:p>
       <w:pPr>
         <w:pStyle w:val="Heading2"/>
@@ -3640,7 +3630,7 @@
         <w:t xml:space="preserve">Essay due Monday, November 23.</w:t>
       </w:r>
     </w:p>
-    <w:bookmarkStart w:id="104" w:name="Xa4bb28432e14a88f4742351691505a49b1698c4"/>
+    <w:bookmarkStart w:id="103" w:name="Xa4bb28432e14a88f4742351691505a49b1698c4"/>
     <w:p>
       <w:pPr>
         <w:pStyle w:val="Heading3"/>
@@ -3666,7 +3656,7 @@
       <w:r>
         <w:t xml:space="preserve"> </w:t>
       </w:r>
-      <w:hyperlink r:id="rId102">
+      <w:hyperlink r:id="rId101">
         <w:r>
           <w:rPr>
             <w:rStyle w:val="Hyperlink"/>
@@ -3713,7 +3703,7 @@
       <w:r>
         <w:t xml:space="preserve"> </w:t>
       </w:r>
-      <w:hyperlink r:id="rId103">
+      <w:hyperlink r:id="rId102">
         <w:r>
           <w:rPr>
             <w:rStyle w:val="Hyperlink"/>
@@ -3727,34 +3717,137 @@
         <w:t xml:space="preserve">. (Jowett translation, Project Gutenberg)</w:t>
       </w:r>
     </w:p>
+    <w:bookmarkEnd w:id="103"/>
+    <w:bookmarkStart w:id="104" w:name="X1409287e655faaa706d560809809ecb7d412b48"/>
+    <w:p>
+      <w:pPr>
+        <w:pStyle w:val="Heading3"/>
+      </w:pPr>
+      <w:r>
+        <w:t xml:space="preserve">Thursday, November 26 — Thanksgiving recess, no class</w:t>
+      </w:r>
+    </w:p>
     <w:bookmarkEnd w:id="104"/>
-    <w:bookmarkStart w:id="105" w:name="X1409287e655faaa706d560809809ecb7d412b48"/>
+    <w:bookmarkEnd w:id="105"/>
+    <w:bookmarkStart w:id="112" w:name="week-14-punishment-and-speech"/>
+    <w:p>
+      <w:pPr>
+        <w:pStyle w:val="Heading2"/>
+      </w:pPr>
+      <w:r>
+        <w:t xml:space="preserve">Week 14: Punishment and Speech</w:t>
+      </w:r>
+    </w:p>
+    <w:bookmarkStart w:id="108" w:name="X79a81136425caf0487efa9b62b3f24f30bbda61"/>
     <w:p>
       <w:pPr>
         <w:pStyle w:val="Heading3"/>
       </w:pPr>
       <w:r>
-        <w:t xml:space="preserve">Thursday, November 26 — Thanksgiving recess, no class</w:t>
-      </w:r>
-    </w:p>
-    <w:bookmarkEnd w:id="105"/>
-    <w:bookmarkEnd w:id="106"/>
-    <w:bookmarkStart w:id="113" w:name="week-14-punishment-and-speech"/>
-    <w:p>
-      <w:pPr>
-        <w:pStyle w:val="Heading2"/>
-      </w:pPr>
-      <w:r>
-        <w:t xml:space="preserve">Week 14: Punishment and Speech</w:t>
-      </w:r>
-    </w:p>
-    <w:bookmarkStart w:id="109" w:name="X79a81136425caf0487efa9b62b3f24f30bbda61"/>
+        <w:t xml:space="preserve">Tuesday, December 01 (Lecture 25) — Theories of punishment</w:t>
+      </w:r>
+    </w:p>
+    <w:p>
+      <w:pPr>
+        <w:pStyle w:val="FirstParagraph"/>
+      </w:pPr>
+      <w:r>
+        <w:rPr>
+          <w:b/>
+          <w:bCs/>
+        </w:rPr>
+        <w:t xml:space="preserve">Required</w:t>
+      </w:r>
+      <w:r>
+        <w:t xml:space="preserve">: Travis Joseph Rodgers,</w:t>
+      </w:r>
+      <w:r>
+        <w:t xml:space="preserve"> </w:t>
+      </w:r>
+      <w:hyperlink r:id="rId106">
+        <w:r>
+          <w:rPr>
+            <w:rStyle w:val="Hyperlink"/>
+          </w:rPr>
+          <w:t xml:space="preserve">“Theories of Punishment”</w:t>
+        </w:r>
+      </w:hyperlink>
+      <w:r>
+        <w:t xml:space="preserve"> </w:t>
+      </w:r>
+      <w:r>
+        <w:t xml:space="preserve">(1000-Word Philosophy).</w:t>
+      </w:r>
+      <w:r>
+        <w:br/>
+      </w:r>
+      <w:r>
+        <w:rPr>
+          <w:b/>
+          <w:bCs/>
+        </w:rPr>
+        <w:t xml:space="preserve">Recommended</w:t>
+      </w:r>
+      <w:r>
+        <w:t xml:space="preserve">: Zachary Hoskins and Anthony Duff,</w:t>
+      </w:r>
+      <w:r>
+        <w:t xml:space="preserve"> </w:t>
+      </w:r>
+      <w:hyperlink r:id="rId107">
+        <w:r>
+          <w:rPr>
+            <w:rStyle w:val="Hyperlink"/>
+          </w:rPr>
+          <w:t xml:space="preserve">“Legal Punishment”</w:t>
+        </w:r>
+      </w:hyperlink>
+      <w:r>
+        <w:t xml:space="preserve">, SEP,</w:t>
+      </w:r>
+      <w:r>
+        <w:t xml:space="preserve"> </w:t>
+      </w:r>
+      <w:r>
+        <w:rPr>
+          <w:b/>
+          <w:bCs/>
+        </w:rPr>
+        <w:t xml:space="preserve">§3-4</w:t>
+      </w:r>
+      <w:r>
+        <w:t xml:space="preserve">,</w:t>
+      </w:r>
+      <w:r>
+        <w:t xml:space="preserve"> </w:t>
+      </w:r>
+      <w:r>
+        <w:t xml:space="preserve">“Consequentialist Accounts”</w:t>
+      </w:r>
+      <w:r>
+        <w:t xml:space="preserve"> </w:t>
+      </w:r>
+      <w:r>
+        <w:t xml:space="preserve">and</w:t>
+      </w:r>
+      <w:r>
+        <w:t xml:space="preserve"> </w:t>
+      </w:r>
+      <w:r>
+        <w:t xml:space="preserve">“Retributivist Accounts”</w:t>
+      </w:r>
+      <w:r>
+        <w:t xml:space="preserve">.</w:t>
+      </w:r>
+    </w:p>
+    <w:bookmarkEnd w:id="108"/>
+    <w:bookmarkStart w:id="111" w:name="X9a2df436863387c404aa2d0a9ac8b7fb026d883"/>
     <w:p>
       <w:pPr>
         <w:pStyle w:val="Heading3"/>
       </w:pPr>
       <w:r>
-        <w:t xml:space="preserve">Tuesday, December 01 (Lecture 25) — Theories of punishment</w:t>
+        <w:t xml:space="preserve">Thursday, December 03 (Lecture 26) — Free speech and the marketplace of ideas</w:t>
       </w:r>
     </w:p>
     <w:p>
@@ -3769,24 +3862,24 @@
         <w:t xml:space="preserve">Required</w:t>
       </w:r>
       <w:r>
-        <w:t xml:space="preserve">: Travis Joseph Rodgers,</w:t>
-      </w:r>
-      <w:r>
-        <w:t xml:space="preserve"> </w:t>
-      </w:r>
-      <w:hyperlink r:id="rId107">
-        <w:r>
-          <w:rPr>
-            <w:rStyle w:val="Hyperlink"/>
-          </w:rPr>
-          <w:t xml:space="preserve">“Theories of Punishment”</w:t>
-        </w:r>
-      </w:hyperlink>
-      <w:r>
-        <w:t xml:space="preserve"> </w:t>
-      </w:r>
-      <w:r>
-        <w:t xml:space="preserve">(1000-Word Philosophy).</w:t>
+        <w:t xml:space="preserve">: Mark Satta,</w:t>
+      </w:r>
+      <w:r>
+        <w:t xml:space="preserve"> </w:t>
+      </w:r>
+      <w:hyperlink r:id="rId109">
+        <w:r>
+          <w:rPr>
+            <w:rStyle w:val="Hyperlink"/>
+          </w:rPr>
+          <w:t xml:space="preserve">“Free Speech”</w:t>
+        </w:r>
+      </w:hyperlink>
+      <w:r>
+        <w:t xml:space="preserve"> </w:t>
+      </w:r>
+      <w:r>
+        <w:t xml:space="preserve">(1000-Word Philosophy)</w:t>
       </w:r>
       <w:r>
         <w:br/>
@@ -3796,118 +3889,15 @@
           <w:b/>
           <w:bCs/>
         </w:rPr>
-        <w:t xml:space="preserve">Recommended</w:t>
-      </w:r>
-      <w:r>
-        <w:t xml:space="preserve">: Zachary Hoskins and Anthony Duff,</w:t>
-      </w:r>
-      <w:r>
-        <w:t xml:space="preserve"> </w:t>
-      </w:r>
-      <w:hyperlink r:id="rId108">
-        <w:r>
-          <w:rPr>
-            <w:rStyle w:val="Hyperlink"/>
-          </w:rPr>
-          <w:t xml:space="preserve">“Legal Punishment”</w:t>
-        </w:r>
-      </w:hyperlink>
-      <w:r>
-        <w:t xml:space="preserve">, SEP,</w:t>
-      </w:r>
-      <w:r>
-        <w:t xml:space="preserve"> </w:t>
-      </w:r>
-      <w:r>
-        <w:rPr>
-          <w:b/>
-          <w:bCs/>
-        </w:rPr>
-        <w:t xml:space="preserve">§3-4</w:t>
-      </w:r>
-      <w:r>
-        <w:t xml:space="preserve">,</w:t>
-      </w:r>
-      <w:r>
-        <w:t xml:space="preserve"> </w:t>
-      </w:r>
-      <w:r>
-        <w:t xml:space="preserve">“Consequentialist Accounts”</w:t>
-      </w:r>
-      <w:r>
-        <w:t xml:space="preserve"> </w:t>
-      </w:r>
-      <w:r>
-        <w:t xml:space="preserve">and</w:t>
-      </w:r>
-      <w:r>
-        <w:t xml:space="preserve"> </w:t>
-      </w:r>
-      <w:r>
-        <w:t xml:space="preserve">“Retributivist Accounts”</w:t>
-      </w:r>
-      <w:r>
-        <w:t xml:space="preserve">.</w:t>
-      </w:r>
-    </w:p>
-    <w:bookmarkEnd w:id="109"/>
-    <w:bookmarkStart w:id="112" w:name="X9a2df436863387c404aa2d0a9ac8b7fb026d883"/>
-    <w:p>
-      <w:pPr>
-        <w:pStyle w:val="Heading3"/>
-      </w:pPr>
-      <w:r>
-        <w:t xml:space="preserve">Thursday, December 03 (Lecture 26) — Free speech and the marketplace of ideas</w:t>
-      </w:r>
-    </w:p>
-    <w:p>
-      <w:pPr>
-        <w:pStyle w:val="FirstParagraph"/>
-      </w:pPr>
-      <w:r>
-        <w:rPr>
-          <w:b/>
-          <w:bCs/>
-        </w:rPr>
         <w:t xml:space="preserve">Required</w:t>
       </w:r>
       <w:r>
-        <w:t xml:space="preserve">: Mark Satta,</w:t>
+        <w:t xml:space="preserve">: J. S. Mill and H. T. Mill,</w:t>
       </w:r>
       <w:r>
         <w:t xml:space="preserve"> </w:t>
       </w:r>
       <w:hyperlink r:id="rId110">
-        <w:r>
-          <w:rPr>
-            <w:rStyle w:val="Hyperlink"/>
-          </w:rPr>
-          <w:t xml:space="preserve">“Free Speech”</w:t>
-        </w:r>
-      </w:hyperlink>
-      <w:r>
-        <w:t xml:space="preserve"> </w:t>
-      </w:r>
-      <w:r>
-        <w:t xml:space="preserve">(1000-Word Philosophy)</w:t>
-      </w:r>
-      <w:r>
-        <w:br/>
-      </w:r>
-      <w:r>
-        <w:rPr>
-          <w:b/>
-          <w:bCs/>
-        </w:rPr>
-        <w:t xml:space="preserve">Required</w:t>
-      </w:r>
-      <w:r>
-        <w:t xml:space="preserve">: J. S. Mill and H. T. Mill,</w:t>
-      </w:r>
-      <w:r>
-        <w:t xml:space="preserve"> </w:t>
-      </w:r>
-      <w:hyperlink r:id="rId111">
         <w:r>
           <w:rPr>
             <w:rStyle w:val="Hyperlink"/>
@@ -3921,9 +3911,9 @@
         <w:t xml:space="preserve">, extract from Chapter 2 on Canvas.</w:t>
       </w:r>
     </w:p>
+    <w:bookmarkEnd w:id="111"/>
     <w:bookmarkEnd w:id="112"/>
-    <w:bookmarkEnd w:id="113"/>
-    <w:bookmarkStart w:id="117" w:name="week-15-ending"/>
+    <w:bookmarkStart w:id="116" w:name="week-15-ending"/>
     <w:p>
       <w:pPr>
         <w:pStyle w:val="Heading2"/>
@@ -3932,7 +3922,7 @@
         <w:t xml:space="preserve">Week 15: Ending</w:t>
       </w:r>
     </w:p>
-    <w:bookmarkStart w:id="115" w:name="X743a790e5d5be054d57feee6607a1932d6cb600"/>
+    <w:bookmarkStart w:id="114" w:name="X743a790e5d5be054d57feee6607a1932d6cb600"/>
     <w:p>
       <w:pPr>
         <w:pStyle w:val="Heading3"/>
@@ -3958,7 +3948,7 @@
       <w:r>
         <w:t xml:space="preserve"> </w:t>
       </w:r>
-      <w:hyperlink r:id="rId114">
+      <w:hyperlink r:id="rId113">
         <w:r>
           <w:rPr>
             <w:rStyle w:val="Hyperlink"/>
@@ -4008,35 +3998,35 @@
         <w:t xml:space="preserve">Module Quiz 4 (Lectures 22–27) opens after class, due Friday.</w:t>
       </w:r>
     </w:p>
+    <w:bookmarkEnd w:id="114"/>
+    <w:bookmarkStart w:id="115" w:name="thursday-december-10-lecture-28-review"/>
+    <w:p>
+      <w:pPr>
+        <w:pStyle w:val="Heading3"/>
+      </w:pPr>
+      <w:r>
+        <w:t xml:space="preserve">Thursday, December 10 (Lecture 28) — Review</w:t>
+      </w:r>
+    </w:p>
+    <w:p>
+      <w:pPr>
+        <w:pStyle w:val="FirstParagraph"/>
+      </w:pPr>
+      <w:r>
+        <w:t xml:space="preserve">No reading. Bring questions.</w:t>
+      </w:r>
+    </w:p>
+    <w:p>
+      <w:pPr>
+        <w:pStyle w:val="BodyText"/>
+      </w:pPr>
+      <w:r>
+        <w:t xml:space="preserve">The final examination is in the University examination period, 14–21 December. The date and room will be posted once the University publishes the schedule.</w:t>
+      </w:r>
+    </w:p>
     <w:bookmarkEnd w:id="115"/>
-    <w:bookmarkStart w:id="116" w:name="thursday-december-10-lecture-28-review"/>
-    <w:p>
-      <w:pPr>
-        <w:pStyle w:val="Heading3"/>
-      </w:pPr>
-      <w:r>
-        <w:t xml:space="preserve">Thursday, December 10 (Lecture 28) — Review</w:t>
-      </w:r>
-    </w:p>
-    <w:p>
-      <w:pPr>
-        <w:pStyle w:val="FirstParagraph"/>
-      </w:pPr>
-      <w:r>
-        <w:t xml:space="preserve">No reading. Bring questions.</w:t>
-      </w:r>
-    </w:p>
-    <w:p>
-      <w:pPr>
-        <w:pStyle w:val="BodyText"/>
-      </w:pPr>
-      <w:r>
-        <w:t xml:space="preserve">The final examination is in the University examination period, 14–21 December. The date and room will be posted once the University publishes the schedule.</w:t>
-      </w:r>
-    </w:p>
     <w:bookmarkEnd w:id="116"/>
     <w:bookmarkEnd w:id="117"/>
-    <w:bookmarkEnd w:id="118"/>
     <w:sectPr>
       <w:footnotePr>
         <w:numRestart w:val="eachSect"/>

</xml_diff>

<commit_message>
Fixed syllabus bug again
</commit_message>
<xml_diff>
--- a/F26-Phil101-site/syllabus-F26-101.docx
+++ b/F26-Phil101-site/syllabus-F26-101.docx
@@ -954,7 +954,7 @@
       </w:r>
     </w:p>
     <w:bookmarkEnd w:id="16"/>
-    <w:bookmarkStart w:id="117" w:name="class-schedule"/>
+    <w:bookmarkStart w:id="118" w:name="class-schedule"/>
     <w:p>
       <w:pPr>
         <w:pStyle w:val="Heading1"/>
@@ -1723,7 +1723,7 @@
     </w:p>
     <w:bookmarkEnd w:id="40"/>
     <w:bookmarkEnd w:id="41"/>
-    <w:bookmarkStart w:id="48" w:name="week-5-science-and-the-mind"/>
+    <w:bookmarkStart w:id="49" w:name="week-5-science-and-the-mind"/>
     <w:p>
       <w:pPr>
         <w:pStyle w:val="Heading2"/>
@@ -1732,7 +1732,7 @@
         <w:t xml:space="preserve">Week 5: Science, and the Mind</w:t>
       </w:r>
     </w:p>
-    <w:bookmarkStart w:id="47" w:name="Xf44765c1fcea86a2394376c21e048eae4d225b4"/>
+    <w:bookmarkStart w:id="44" w:name="Xf44765c1fcea86a2394376c21e048eae4d225b4"/>
     <w:p>
       <w:pPr>
         <w:pStyle w:val="Heading3"/>
@@ -1856,16 +1856,20 @@
         </w:rPr>
         <w:t xml:space="preserve">Module Quiz 1 (Lectures 1–9) opens after class, due Sunday.</w:t>
       </w:r>
-      <w:r>
-        <w:t xml:space="preserve"> </w:t>
-      </w:r>
-      <w:r>
-        <w:t xml:space="preserve">### Thursday, October 01 (Lecture 10) — Perception reconsidered</w:t>
-      </w:r>
-    </w:p>
-    <w:p>
-      <w:pPr>
-        <w:pStyle w:val="BodyText"/>
+    </w:p>
+    <w:bookmarkEnd w:id="44"/>
+    <w:bookmarkStart w:id="48" w:name="X0b9314308d9385921b437b2ed817f2353b12170"/>
+    <w:p>
+      <w:pPr>
+        <w:pStyle w:val="Heading3"/>
+      </w:pPr>
+      <w:r>
+        <w:t xml:space="preserve">Thursday, October 01 (Lecture 10) — Perception reconsidered</w:t>
+      </w:r>
+    </w:p>
+    <w:p>
+      <w:pPr>
+        <w:pStyle w:val="FirstParagraph"/>
       </w:pPr>
       <w:r>
         <w:rPr>
@@ -1880,7 +1884,7 @@
       <w:r>
         <w:t xml:space="preserve"> </w:t>
       </w:r>
-      <w:hyperlink r:id="rId44">
+      <w:hyperlink r:id="rId45">
         <w:r>
           <w:rPr>
             <w:rStyle w:val="Hyperlink"/>
@@ -1915,7 +1919,7 @@
       <w:r>
         <w:t xml:space="preserve"> </w:t>
       </w:r>
-      <w:hyperlink r:id="rId45">
+      <w:hyperlink r:id="rId46">
         <w:r>
           <w:rPr>
             <w:rStyle w:val="Hyperlink"/>
@@ -1964,7 +1968,7 @@
       <w:r>
         <w:t xml:space="preserve"> </w:t>
       </w:r>
-      <w:hyperlink r:id="rId46">
+      <w:hyperlink r:id="rId47">
         <w:r>
           <w:rPr>
             <w:rStyle w:val="Hyperlink"/>
@@ -1976,9 +1980,9 @@
         <w:t xml:space="preserve">, IEP.</w:t>
       </w:r>
     </w:p>
-    <w:bookmarkEnd w:id="47"/>
     <w:bookmarkEnd w:id="48"/>
-    <w:bookmarkStart w:id="54" w:name="week-6-consciousness"/>
+    <w:bookmarkEnd w:id="49"/>
+    <w:bookmarkStart w:id="55" w:name="week-6-consciousness"/>
     <w:p>
       <w:pPr>
         <w:pStyle w:val="Heading2"/>
@@ -1999,7 +2003,7 @@
         <w:t xml:space="preserve">Short Answer 1 is written in section this week.</w:t>
       </w:r>
     </w:p>
-    <w:bookmarkStart w:id="50" w:name="X200a3672f4c346e20ebf81884b33047daa72e40"/>
+    <w:bookmarkStart w:id="51" w:name="X200a3672f4c346e20ebf81884b33047daa72e40"/>
     <w:p>
       <w:pPr>
         <w:pStyle w:val="Heading3"/>
@@ -2025,7 +2029,7 @@
       <w:r>
         <w:t xml:space="preserve"> </w:t>
       </w:r>
-      <w:hyperlink r:id="rId49">
+      <w:hyperlink r:id="rId50">
         <w:r>
           <w:rPr>
             <w:rStyle w:val="Hyperlink"/>
@@ -2037,8 +2041,8 @@
         <w:t xml:space="preserve">. Note this is slightly more reading than most days in class.</w:t>
       </w:r>
     </w:p>
-    <w:bookmarkEnd w:id="50"/>
-    <w:bookmarkStart w:id="53" w:name="X5c0ffa8a65d715d07dd794e56183fe1c6a9b038"/>
+    <w:bookmarkEnd w:id="51"/>
+    <w:bookmarkStart w:id="54" w:name="X5c0ffa8a65d715d07dd794e56183fe1c6a9b038"/>
     <w:p>
       <w:pPr>
         <w:pStyle w:val="Heading3"/>
@@ -2064,7 +2068,7 @@
       <w:r>
         <w:t xml:space="preserve"> </w:t>
       </w:r>
-      <w:hyperlink r:id="rId51">
+      <w:hyperlink r:id="rId52">
         <w:r>
           <w:rPr>
             <w:rStyle w:val="Hyperlink"/>
@@ -2094,7 +2098,7 @@
       <w:r>
         <w:t xml:space="preserve"> </w:t>
       </w:r>
-      <w:hyperlink r:id="rId52">
+      <w:hyperlink r:id="rId53">
         <w:r>
           <w:rPr>
             <w:rStyle w:val="Hyperlink"/>
@@ -2118,9 +2122,9 @@
         <w:t xml:space="preserve">Short Answer 2 goes out after class, on Lectures 10 to 12, due Friday 23 October.</w:t>
       </w:r>
     </w:p>
-    <w:bookmarkEnd w:id="53"/>
     <w:bookmarkEnd w:id="54"/>
-    <w:bookmarkStart w:id="63" w:name="week-7-dualism"/>
+    <w:bookmarkEnd w:id="55"/>
+    <w:bookmarkStart w:id="64" w:name="week-7-dualism"/>
     <w:p>
       <w:pPr>
         <w:pStyle w:val="Heading2"/>
@@ -2129,7 +2133,7 @@
         <w:t xml:space="preserve">Week 7: Dualism</w:t>
       </w:r>
     </w:p>
-    <w:bookmarkStart w:id="59" w:name="X28f07e07b0ed06b9de4ffbf5e0d4c03242e17c1"/>
+    <w:bookmarkStart w:id="60" w:name="X28f07e07b0ed06b9de4ffbf5e0d4c03242e17c1"/>
     <w:p>
       <w:pPr>
         <w:pStyle w:val="Heading3"/>
@@ -2155,7 +2159,7 @@
       <w:r>
         <w:t xml:space="preserve"> </w:t>
       </w:r>
-      <w:hyperlink r:id="rId55">
+      <w:hyperlink r:id="rId56">
         <w:r>
           <w:rPr>
             <w:rStyle w:val="Hyperlink"/>
@@ -2208,7 +2212,7 @@
       <w:r>
         <w:t xml:space="preserve"> </w:t>
       </w:r>
-      <w:hyperlink r:id="rId56">
+      <w:hyperlink r:id="rId57">
         <w:r>
           <w:rPr>
             <w:rStyle w:val="Hyperlink"/>
@@ -2264,7 +2268,7 @@
       <w:r>
         <w:t xml:space="preserve"> </w:t>
       </w:r>
-      <w:hyperlink r:id="rId57">
+      <w:hyperlink r:id="rId58">
         <w:r>
           <w:rPr>
             <w:rStyle w:val="Hyperlink"/>
@@ -2327,50 +2331,50 @@
       <w:r>
         <w:t xml:space="preserve"> </w:t>
       </w:r>
+      <w:hyperlink r:id="rId59">
+        <w:r>
+          <w:rPr>
+            <w:rStyle w:val="Hyperlink"/>
+          </w:rPr>
+          <w:t xml:space="preserve">Meditation VI</w:t>
+        </w:r>
+      </w:hyperlink>
+      <w:r>
+        <w:t xml:space="preserve">, translated by Jonathan Bennett.</w:t>
+      </w:r>
+    </w:p>
+    <w:bookmarkEnd w:id="60"/>
+    <w:bookmarkStart w:id="63" w:name="X0071eb8764b9615fa532bae8d3896a626f200f7"/>
+    <w:p>
+      <w:pPr>
+        <w:pStyle w:val="Heading3"/>
+      </w:pPr>
+      <w:r>
+        <w:t xml:space="preserve">Thursday, October 15 (Lecture 14) — The case against Dualism</w:t>
+      </w:r>
+    </w:p>
+    <w:p>
+      <w:pPr>
+        <w:pStyle w:val="FirstParagraph"/>
+      </w:pPr>
+      <w:r>
+        <w:rPr>
+          <w:b/>
+          <w:bCs/>
+        </w:rPr>
+        <w:t xml:space="preserve">Required</w:t>
+      </w:r>
+      <w:r>
+        <w:t xml:space="preserve">: Jacob Berger,</w:t>
+      </w:r>
+      <w:r>
+        <w:t xml:space="preserve"> </w:t>
+      </w:r>
       <w:hyperlink r:id="rId58">
         <w:r>
           <w:rPr>
             <w:rStyle w:val="Hyperlink"/>
           </w:rPr>
-          <w:t xml:space="preserve">Meditation VI</w:t>
-        </w:r>
-      </w:hyperlink>
-      <w:r>
-        <w:t xml:space="preserve">, translated by Jonathan Bennett.</w:t>
-      </w:r>
-    </w:p>
-    <w:bookmarkEnd w:id="59"/>
-    <w:bookmarkStart w:id="62" w:name="X0071eb8764b9615fa532bae8d3896a626f200f7"/>
-    <w:p>
-      <w:pPr>
-        <w:pStyle w:val="Heading3"/>
-      </w:pPr>
-      <w:r>
-        <w:t xml:space="preserve">Thursday, October 15 (Lecture 14) — The case against Dualism</w:t>
-      </w:r>
-    </w:p>
-    <w:p>
-      <w:pPr>
-        <w:pStyle w:val="FirstParagraph"/>
-      </w:pPr>
-      <w:r>
-        <w:rPr>
-          <w:b/>
-          <w:bCs/>
-        </w:rPr>
-        <w:t xml:space="preserve">Required</w:t>
-      </w:r>
-      <w:r>
-        <w:t xml:space="preserve">: Jacob Berger,</w:t>
-      </w:r>
-      <w:r>
-        <w:t xml:space="preserve"> </w:t>
-      </w:r>
-      <w:hyperlink r:id="rId57">
-        <w:r>
-          <w:rPr>
-            <w:rStyle w:val="Hyperlink"/>
-          </w:rPr>
           <w:t xml:space="preserve">“The Mind-Body Problem: What Are Minds?”</w:t>
         </w:r>
         <w:r>
@@ -2405,7 +2409,7 @@
       <w:r>
         <w:t xml:space="preserve"> </w:t>
       </w:r>
-      <w:hyperlink r:id="rId60">
+      <w:hyperlink r:id="rId61">
         <w:r>
           <w:rPr>
             <w:rStyle w:val="Hyperlink"/>
@@ -2432,7 +2436,7 @@
       <w:r>
         <w:t xml:space="preserve"> </w:t>
       </w:r>
-      <w:hyperlink r:id="rId61">
+      <w:hyperlink r:id="rId62">
         <w:r>
           <w:rPr>
             <w:rStyle w:val="Hyperlink"/>
@@ -2456,9 +2460,9 @@
         <w:t xml:space="preserve">Module Quiz 2 (Lectures 10–14) opens after class, due Sunday 1 November.</w:t>
       </w:r>
     </w:p>
-    <w:bookmarkEnd w:id="62"/>
     <w:bookmarkEnd w:id="63"/>
-    <w:bookmarkStart w:id="69" w:name="week-8-consequentialism"/>
+    <w:bookmarkEnd w:id="64"/>
+    <w:bookmarkStart w:id="70" w:name="week-8-consequentialism"/>
     <w:p>
       <w:pPr>
         <w:pStyle w:val="Heading2"/>
@@ -2479,7 +2483,7 @@
         <w:t xml:space="preserve">Short Answer 2 due Friday, October 23.</w:t>
       </w:r>
     </w:p>
-    <w:bookmarkStart w:id="64" w:name="X96837ae1114282219fbf9d652d877050467c741"/>
+    <w:bookmarkStart w:id="65" w:name="X96837ae1114282219fbf9d652d877050467c741"/>
     <w:p>
       <w:pPr>
         <w:pStyle w:val="Heading3"/>
@@ -2488,8 +2492,8 @@
         <w:t xml:space="preserve">Tuesday, October 20 — Fall Study Break, no class</w:t>
       </w:r>
     </w:p>
-    <w:bookmarkEnd w:id="64"/>
-    <w:bookmarkStart w:id="68" w:name="Xd0b8d34e58df369132c6104348308b4c66e51b4"/>
+    <w:bookmarkEnd w:id="65"/>
+    <w:bookmarkStart w:id="69" w:name="Xd0b8d34e58df369132c6104348308b4c66e51b4"/>
     <w:p>
       <w:pPr>
         <w:pStyle w:val="Heading3"/>
@@ -2515,7 +2519,7 @@
       <w:r>
         <w:t xml:space="preserve"> </w:t>
       </w:r>
-      <w:hyperlink r:id="rId65">
+      <w:hyperlink r:id="rId66">
         <w:r>
           <w:rPr>
             <w:rStyle w:val="Hyperlink"/>
@@ -2545,7 +2549,7 @@
       <w:r>
         <w:t xml:space="preserve"> </w:t>
       </w:r>
-      <w:hyperlink r:id="rId66">
+      <w:hyperlink r:id="rId67">
         <w:r>
           <w:rPr>
             <w:rStyle w:val="Hyperlink"/>
@@ -2577,7 +2581,7 @@
       <w:r>
         <w:t xml:space="preserve"> </w:t>
       </w:r>
-      <w:hyperlink r:id="rId67">
+      <w:hyperlink r:id="rId68">
         <w:r>
           <w:rPr>
             <w:rStyle w:val="Hyperlink"/>
@@ -2608,9 +2612,9 @@
         <w:t xml:space="preserve">“Classic Utilitarianism.”</w:t>
       </w:r>
     </w:p>
-    <w:bookmarkEnd w:id="68"/>
     <w:bookmarkEnd w:id="69"/>
-    <w:bookmarkStart w:id="77" w:name="week-9-deontology-and-trolleys"/>
+    <w:bookmarkEnd w:id="70"/>
+    <w:bookmarkStart w:id="78" w:name="week-9-deontology-and-trolleys"/>
     <w:p>
       <w:pPr>
         <w:pStyle w:val="Heading2"/>
@@ -2619,7 +2623,7 @@
         <w:t xml:space="preserve">Week 9: Deontology and Trolleys</w:t>
       </w:r>
     </w:p>
-    <w:bookmarkStart w:id="73" w:name="tuesday-october-27-lecture-16-deontology"/>
+    <w:bookmarkStart w:id="74" w:name="tuesday-october-27-lecture-16-deontology"/>
     <w:p>
       <w:pPr>
         <w:pStyle w:val="Heading3"/>
@@ -2645,7 +2649,7 @@
       <w:r>
         <w:t xml:space="preserve"> </w:t>
       </w:r>
-      <w:hyperlink r:id="rId70">
+      <w:hyperlink r:id="rId71">
         <w:r>
           <w:rPr>
             <w:rStyle w:val="Hyperlink"/>
@@ -2675,7 +2679,7 @@
       <w:r>
         <w:t xml:space="preserve"> </w:t>
       </w:r>
-      <w:hyperlink r:id="rId71">
+      <w:hyperlink r:id="rId72">
         <w:r>
           <w:rPr>
             <w:rStyle w:val="Hyperlink"/>
@@ -2724,7 +2728,7 @@
       <w:r>
         <w:t xml:space="preserve"> </w:t>
       </w:r>
-      <w:hyperlink r:id="rId72">
+      <w:hyperlink r:id="rId73">
         <w:r>
           <w:rPr>
             <w:rStyle w:val="Hyperlink"/>
@@ -2738,8 +2742,8 @@
         <w:t xml:space="preserve">, translated by Jonathan Bennett, Chapter 1, especially the opening on the good will and the passages on universal law.</w:t>
       </w:r>
     </w:p>
-    <w:bookmarkEnd w:id="73"/>
-    <w:bookmarkStart w:id="76" w:name="Xf9503ef139db4d04bbf75454be19f247653d6bf"/>
+    <w:bookmarkEnd w:id="74"/>
+    <w:bookmarkStart w:id="77" w:name="Xf9503ef139db4d04bbf75454be19f247653d6bf"/>
     <w:p>
       <w:pPr>
         <w:pStyle w:val="Heading3"/>
@@ -2765,7 +2769,7 @@
       <w:r>
         <w:t xml:space="preserve"> </w:t>
       </w:r>
-      <w:hyperlink r:id="rId74">
+      <w:hyperlink r:id="rId75">
         <w:r>
           <w:rPr>
             <w:rStyle w:val="Hyperlink"/>
@@ -2795,7 +2799,7 @@
       <w:r>
         <w:t xml:space="preserve"> </w:t>
       </w:r>
-      <w:hyperlink r:id="rId75">
+      <w:hyperlink r:id="rId76">
         <w:r>
           <w:rPr>
             <w:rStyle w:val="Hyperlink"/>
@@ -2807,9 +2811,9 @@
         <w:t xml:space="preserve">, sections I and II.</w:t>
       </w:r>
     </w:p>
-    <w:bookmarkEnd w:id="76"/>
     <w:bookmarkEnd w:id="77"/>
-    <w:bookmarkStart w:id="84" w:name="week-10-what-makes-a-life-go-well"/>
+    <w:bookmarkEnd w:id="78"/>
+    <w:bookmarkStart w:id="85" w:name="week-10-what-makes-a-life-go-well"/>
     <w:p>
       <w:pPr>
         <w:pStyle w:val="Heading2"/>
@@ -2818,7 +2822,7 @@
         <w:t xml:space="preserve">Week 10: What Makes a Life Go Well</w:t>
       </w:r>
     </w:p>
-    <w:bookmarkStart w:id="80" w:name="Xfa27847b8ca2d7448cd55c9f9be995321b42872"/>
+    <w:bookmarkStart w:id="81" w:name="Xfa27847b8ca2d7448cd55c9f9be995321b42872"/>
     <w:p>
       <w:pPr>
         <w:pStyle w:val="Heading3"/>
@@ -2844,7 +2848,7 @@
       <w:r>
         <w:t xml:space="preserve"> </w:t>
       </w:r>
-      <w:hyperlink r:id="rId78">
+      <w:hyperlink r:id="rId79">
         <w:r>
           <w:rPr>
             <w:rStyle w:val="Hyperlink"/>
@@ -2871,7 +2875,7 @@
       <w:r>
         <w:t xml:space="preserve"> </w:t>
       </w:r>
-      <w:hyperlink r:id="rId79">
+      <w:hyperlink r:id="rId80">
         <w:r>
           <w:rPr>
             <w:rStyle w:val="Hyperlink"/>
@@ -2902,8 +2906,8 @@
         <w:t xml:space="preserve">“The Concept.”</w:t>
       </w:r>
     </w:p>
-    <w:bookmarkEnd w:id="80"/>
-    <w:bookmarkStart w:id="83" w:name="thursday-november-05-lecture-19-hedonism"/>
+    <w:bookmarkEnd w:id="81"/>
+    <w:bookmarkStart w:id="84" w:name="thursday-november-05-lecture-19-hedonism"/>
     <w:p>
       <w:pPr>
         <w:pStyle w:val="Heading3"/>
@@ -2929,7 +2933,7 @@
       <w:r>
         <w:t xml:space="preserve"> </w:t>
       </w:r>
-      <w:hyperlink r:id="rId81">
+      <w:hyperlink r:id="rId82">
         <w:r>
           <w:rPr>
             <w:rStyle w:val="Hyperlink"/>
@@ -2975,7 +2979,7 @@
       <w:r>
         <w:t xml:space="preserve"> </w:t>
       </w:r>
-      <w:hyperlink r:id="rId82">
+      <w:hyperlink r:id="rId83">
         <w:r>
           <w:rPr>
             <w:rStyle w:val="Hyperlink"/>
@@ -3005,9 +3009,9 @@
         <w:t xml:space="preserve">(AGAIN, IT MIGHT BE BEST TO DISTRIBUTE ESSAY QUESTIONS EARLIER)</w:t>
       </w:r>
     </w:p>
-    <w:bookmarkEnd w:id="83"/>
     <w:bookmarkEnd w:id="84"/>
-    <w:bookmarkStart w:id="91" w:name="week-11-desire-and-the-objective-list"/>
+    <w:bookmarkEnd w:id="85"/>
+    <w:bookmarkStart w:id="92" w:name="week-11-desire-and-the-objective-list"/>
     <w:p>
       <w:pPr>
         <w:pStyle w:val="Heading2"/>
@@ -3016,7 +3020,7 @@
         <w:t xml:space="preserve">Week 11: Desire, and the Objective List</w:t>
       </w:r>
     </w:p>
-    <w:bookmarkStart w:id="86" w:name="X79631354aa8d6bc57231d28d4dc4739aa6c34da"/>
+    <w:bookmarkStart w:id="87" w:name="X79631354aa8d6bc57231d28d4dc4739aa6c34da"/>
     <w:p>
       <w:pPr>
         <w:pStyle w:val="Heading3"/>
@@ -3042,7 +3046,7 @@
       <w:r>
         <w:t xml:space="preserve"> </w:t>
       </w:r>
-      <w:hyperlink r:id="rId85">
+      <w:hyperlink r:id="rId86">
         <w:r>
           <w:rPr>
             <w:rStyle w:val="Hyperlink"/>
@@ -3091,7 +3095,7 @@
       <w:r>
         <w:t xml:space="preserve"> </w:t>
       </w:r>
-      <w:hyperlink r:id="rId78">
+      <w:hyperlink r:id="rId79">
         <w:r>
           <w:rPr>
             <w:rStyle w:val="Hyperlink"/>
@@ -3103,8 +3107,8 @@
         <w:t xml:space="preserve">, the desire-theory section.</w:t>
       </w:r>
     </w:p>
-    <w:bookmarkEnd w:id="86"/>
-    <w:bookmarkStart w:id="90" w:name="X10a570f0a704e9c5b54652dbcd8cc810abb2eca"/>
+    <w:bookmarkEnd w:id="87"/>
+    <w:bookmarkStart w:id="91" w:name="X10a570f0a704e9c5b54652dbcd8cc810abb2eca"/>
     <w:p>
       <w:pPr>
         <w:pStyle w:val="Heading3"/>
@@ -3130,7 +3134,7 @@
       <w:r>
         <w:t xml:space="preserve"> </w:t>
       </w:r>
-      <w:hyperlink r:id="rId79">
+      <w:hyperlink r:id="rId80">
         <w:r>
           <w:rPr>
             <w:rStyle w:val="Hyperlink"/>
@@ -3176,7 +3180,7 @@
       <w:r>
         <w:t xml:space="preserve"> </w:t>
       </w:r>
-      <w:hyperlink r:id="rId87">
+      <w:hyperlink r:id="rId88">
         <w:r>
           <w:rPr>
             <w:rStyle w:val="Hyperlink"/>
@@ -3250,7 +3254,7 @@
       <w:r>
         <w:t xml:space="preserve"> </w:t>
       </w:r>
-      <w:hyperlink r:id="rId88">
+      <w:hyperlink r:id="rId89">
         <w:r>
           <w:rPr>
             <w:rStyle w:val="Hyperlink"/>
@@ -3290,7 +3294,7 @@
       <w:r>
         <w:t xml:space="preserve"> </w:t>
       </w:r>
-      <w:hyperlink r:id="rId89">
+      <w:hyperlink r:id="rId90">
         <w:r>
           <w:rPr>
             <w:rStyle w:val="Hyperlink"/>
@@ -3327,9 +3331,9 @@
         <w:t xml:space="preserve">Module Quiz 3 (Lectures 15–21) opens after class.</w:t>
       </w:r>
     </w:p>
-    <w:bookmarkEnd w:id="90"/>
     <w:bookmarkEnd w:id="91"/>
-    <w:bookmarkStart w:id="100" w:name="week-12-the-self"/>
+    <w:bookmarkEnd w:id="92"/>
+    <w:bookmarkStart w:id="101" w:name="week-12-the-self"/>
     <w:p>
       <w:pPr>
         <w:pStyle w:val="Heading2"/>
@@ -3338,7 +3342,7 @@
         <w:t xml:space="preserve">Week 12: The Self</w:t>
       </w:r>
     </w:p>
-    <w:bookmarkStart w:id="95" w:name="Xd41dee43ab2ae7aade769c2c5526b30fecfa0af"/>
+    <w:bookmarkStart w:id="96" w:name="Xd41dee43ab2ae7aade769c2c5526b30fecfa0af"/>
     <w:p>
       <w:pPr>
         <w:pStyle w:val="Heading3"/>
@@ -3364,7 +3368,7 @@
       <w:r>
         <w:t xml:space="preserve"> </w:t>
       </w:r>
-      <w:hyperlink r:id="rId92">
+      <w:hyperlink r:id="rId93">
         <w:r>
           <w:rPr>
             <w:rStyle w:val="Hyperlink"/>
@@ -3394,7 +3398,7 @@
       <w:r>
         <w:t xml:space="preserve"> </w:t>
       </w:r>
-      <w:hyperlink r:id="rId93">
+      <w:hyperlink r:id="rId94">
         <w:r>
           <w:rPr>
             <w:rStyle w:val="Hyperlink"/>
@@ -3421,7 +3425,7 @@
       <w:r>
         <w:t xml:space="preserve"> </w:t>
       </w:r>
-      <w:hyperlink r:id="rId94">
+      <w:hyperlink r:id="rId95">
         <w:r>
           <w:rPr>
             <w:rStyle w:val="Hyperlink"/>
@@ -3436,8 +3440,8 @@
         <w:t xml:space="preserve">(1000-Word Philosophy).</w:t>
       </w:r>
     </w:p>
-    <w:bookmarkEnd w:id="95"/>
-    <w:bookmarkStart w:id="99" w:name="X7b137362c18c82fd08f57a4d05c8acf900f9e5f"/>
+    <w:bookmarkEnd w:id="96"/>
+    <w:bookmarkStart w:id="100" w:name="X7b137362c18c82fd08f57a4d05c8acf900f9e5f"/>
     <w:p>
       <w:pPr>
         <w:pStyle w:val="Heading3"/>
@@ -3463,7 +3467,7 @@
       <w:r>
         <w:t xml:space="preserve"> </w:t>
       </w:r>
-      <w:hyperlink r:id="rId96">
+      <w:hyperlink r:id="rId97">
         <w:r>
           <w:rPr>
             <w:rStyle w:val="Hyperlink"/>
@@ -3498,7 +3502,7 @@
       <w:r>
         <w:t xml:space="preserve"> </w:t>
       </w:r>
-      <w:hyperlink r:id="rId97">
+      <w:hyperlink r:id="rId98">
         <w:r>
           <w:rPr>
             <w:rStyle w:val="Hyperlink"/>
@@ -3528,7 +3532,7 @@
       <w:r>
         <w:t xml:space="preserve"> </w:t>
       </w:r>
-      <w:hyperlink r:id="rId98">
+      <w:hyperlink r:id="rId99">
         <w:r>
           <w:rPr>
             <w:rStyle w:val="Hyperlink"/>
@@ -3587,7 +3591,7 @@
       <w:r>
         <w:t xml:space="preserve"> </w:t>
       </w:r>
-      <w:hyperlink r:id="rId96">
+      <w:hyperlink r:id="rId97">
         <w:r>
           <w:rPr>
             <w:rStyle w:val="Hyperlink"/>
@@ -3607,9 +3611,9 @@
         <w:t xml:space="preserve">, all of Chapter xxvii, for anyone who wants to see the details of Locke’s view in a more original form.</w:t>
       </w:r>
     </w:p>
-    <w:bookmarkEnd w:id="99"/>
     <w:bookmarkEnd w:id="100"/>
-    <w:bookmarkStart w:id="105" w:name="week-13-law"/>
+    <w:bookmarkEnd w:id="101"/>
+    <w:bookmarkStart w:id="106" w:name="week-13-law"/>
     <w:p>
       <w:pPr>
         <w:pStyle w:val="Heading2"/>
@@ -3630,7 +3634,7 @@
         <w:t xml:space="preserve">Essay due Monday, November 23.</w:t>
       </w:r>
     </w:p>
-    <w:bookmarkStart w:id="103" w:name="Xa4bb28432e14a88f4742351691505a49b1698c4"/>
+    <w:bookmarkStart w:id="104" w:name="Xa4bb28432e14a88f4742351691505a49b1698c4"/>
     <w:p>
       <w:pPr>
         <w:pStyle w:val="Heading3"/>
@@ -3656,7 +3660,7 @@
       <w:r>
         <w:t xml:space="preserve"> </w:t>
       </w:r>
-      <w:hyperlink r:id="rId101">
+      <w:hyperlink r:id="rId102">
         <w:r>
           <w:rPr>
             <w:rStyle w:val="Hyperlink"/>
@@ -3703,7 +3707,7 @@
       <w:r>
         <w:t xml:space="preserve"> </w:t>
       </w:r>
-      <w:hyperlink r:id="rId102">
+      <w:hyperlink r:id="rId103">
         <w:r>
           <w:rPr>
             <w:rStyle w:val="Hyperlink"/>
@@ -3717,8 +3721,8 @@
         <w:t xml:space="preserve">. (Jowett translation, Project Gutenberg)</w:t>
       </w:r>
     </w:p>
-    <w:bookmarkEnd w:id="103"/>
-    <w:bookmarkStart w:id="104" w:name="X1409287e655faaa706d560809809ecb7d412b48"/>
+    <w:bookmarkEnd w:id="104"/>
+    <w:bookmarkStart w:id="105" w:name="X1409287e655faaa706d560809809ecb7d412b48"/>
     <w:p>
       <w:pPr>
         <w:pStyle w:val="Heading3"/>
@@ -3727,9 +3731,9 @@
         <w:t xml:space="preserve">Thursday, November 26 — Thanksgiving recess, no class</w:t>
       </w:r>
     </w:p>
-    <w:bookmarkEnd w:id="104"/>
     <w:bookmarkEnd w:id="105"/>
-    <w:bookmarkStart w:id="112" w:name="week-14-punishment-and-speech"/>
+    <w:bookmarkEnd w:id="106"/>
+    <w:bookmarkStart w:id="113" w:name="week-14-punishment-and-speech"/>
     <w:p>
       <w:pPr>
         <w:pStyle w:val="Heading2"/>
@@ -3738,7 +3742,7 @@
         <w:t xml:space="preserve">Week 14: Punishment and Speech</w:t>
       </w:r>
     </w:p>
-    <w:bookmarkStart w:id="108" w:name="X79a81136425caf0487efa9b62b3f24f30bbda61"/>
+    <w:bookmarkStart w:id="109" w:name="X79a81136425caf0487efa9b62b3f24f30bbda61"/>
     <w:p>
       <w:pPr>
         <w:pStyle w:val="Heading3"/>
@@ -3764,7 +3768,7 @@
       <w:r>
         <w:t xml:space="preserve"> </w:t>
       </w:r>
-      <w:hyperlink r:id="rId106">
+      <w:hyperlink r:id="rId107">
         <w:r>
           <w:rPr>
             <w:rStyle w:val="Hyperlink"/>
@@ -3794,7 +3798,7 @@
       <w:r>
         <w:t xml:space="preserve"> </w:t>
       </w:r>
-      <w:hyperlink r:id="rId107">
+      <w:hyperlink r:id="rId108">
         <w:r>
           <w:rPr>
             <w:rStyle w:val="Hyperlink"/>
@@ -3840,8 +3844,8 @@
         <w:t xml:space="preserve">.</w:t>
       </w:r>
     </w:p>
-    <w:bookmarkEnd w:id="108"/>
-    <w:bookmarkStart w:id="111" w:name="X9a2df436863387c404aa2d0a9ac8b7fb026d883"/>
+    <w:bookmarkEnd w:id="109"/>
+    <w:bookmarkStart w:id="112" w:name="X9a2df436863387c404aa2d0a9ac8b7fb026d883"/>
     <w:p>
       <w:pPr>
         <w:pStyle w:val="Heading3"/>
@@ -3867,7 +3871,7 @@
       <w:r>
         <w:t xml:space="preserve"> </w:t>
       </w:r>
-      <w:hyperlink r:id="rId109">
+      <w:hyperlink r:id="rId110">
         <w:r>
           <w:rPr>
             <w:rStyle w:val="Hyperlink"/>
@@ -3897,7 +3901,7 @@
       <w:r>
         <w:t xml:space="preserve"> </w:t>
       </w:r>
-      <w:hyperlink r:id="rId110">
+      <w:hyperlink r:id="rId111">
         <w:r>
           <w:rPr>
             <w:rStyle w:val="Hyperlink"/>
@@ -3911,9 +3915,9 @@
         <w:t xml:space="preserve">, extract from Chapter 2 on Canvas.</w:t>
       </w:r>
     </w:p>
-    <w:bookmarkEnd w:id="111"/>
     <w:bookmarkEnd w:id="112"/>
-    <w:bookmarkStart w:id="116" w:name="week-15-ending"/>
+    <w:bookmarkEnd w:id="113"/>
+    <w:bookmarkStart w:id="117" w:name="week-15-ending"/>
     <w:p>
       <w:pPr>
         <w:pStyle w:val="Heading2"/>
@@ -3922,7 +3926,7 @@
         <w:t xml:space="preserve">Week 15: Ending</w:t>
       </w:r>
     </w:p>
-    <w:bookmarkStart w:id="114" w:name="X743a790e5d5be054d57feee6607a1932d6cb600"/>
+    <w:bookmarkStart w:id="115" w:name="X743a790e5d5be054d57feee6607a1932d6cb600"/>
     <w:p>
       <w:pPr>
         <w:pStyle w:val="Heading3"/>
@@ -3948,7 +3952,7 @@
       <w:r>
         <w:t xml:space="preserve"> </w:t>
       </w:r>
-      <w:hyperlink r:id="rId113">
+      <w:hyperlink r:id="rId114">
         <w:r>
           <w:rPr>
             <w:rStyle w:val="Hyperlink"/>
@@ -3998,8 +4002,8 @@
         <w:t xml:space="preserve">Module Quiz 4 (Lectures 22–27) opens after class, due Friday.</w:t>
       </w:r>
     </w:p>
-    <w:bookmarkEnd w:id="114"/>
-    <w:bookmarkStart w:id="115" w:name="thursday-december-10-lecture-28-review"/>
+    <w:bookmarkEnd w:id="115"/>
+    <w:bookmarkStart w:id="116" w:name="thursday-december-10-lecture-28-review"/>
     <w:p>
       <w:pPr>
         <w:pStyle w:val="Heading3"/>
@@ -4024,9 +4028,9 @@
         <w:t xml:space="preserve">The final examination is in the University examination period, 14–21 December. The date and room will be posted once the University publishes the schedule.</w:t>
       </w:r>
     </w:p>
-    <w:bookmarkEnd w:id="115"/>
     <w:bookmarkEnd w:id="116"/>
     <w:bookmarkEnd w:id="117"/>
+    <w:bookmarkEnd w:id="118"/>
     <w:sectPr>
       <w:footnotePr>
         <w:numRestart w:val="eachSect"/>

</xml_diff>

<commit_message>
101.15 done, 101.16, 101.17, 444.15 drafted
</commit_message>
<xml_diff>
--- a/F26-Phil101-site/syllabus-F26-101.docx
+++ b/F26-Phil101-site/syllabus-F26-101.docx
@@ -2654,7 +2654,7 @@
           <w:rPr>
             <w:rStyle w:val="Hyperlink"/>
           </w:rPr>
-          <w:t xml:space="preserve">“Deontology: Kantian Ethics”</w:t>
+          <w:t xml:space="preserve">“Kantian Deontology: Immanuel Kant’s Ethics”</w:t>
         </w:r>
       </w:hyperlink>
       <w:r>
@@ -2739,7 +2739,7 @@
         </w:r>
       </w:hyperlink>
       <w:r>
-        <w:t xml:space="preserve">, translated by Jonathan Bennett, Chapter 1, especially the opening on the good will and the passages on universal law.</w:t>
+        <w:t xml:space="preserve">, translated by Jonathan Bennett, Chapter 1, especially the passages on universal law.</w:t>
       </w:r>
     </w:p>
     <w:bookmarkEnd w:id="74"/>
@@ -2808,7 +2808,7 @@
         </w:r>
       </w:hyperlink>
       <w:r>
-        <w:t xml:space="preserve">, sections I and II.</w:t>
+        <w:t xml:space="preserve">, sections I to IV (pp. 1395-1403, about nine pages). [I’d previously just said sections I to II, but actually III and IV are important to having all the variants we’ll discuss in front of you, and this is still only 9 pages.]</w:t>
       </w:r>
     </w:p>
     <w:bookmarkEnd w:id="77"/>

</xml_diff>